<commit_message>
Papers: final Chinese editions (authors, references complete, CI-green note)
</commit_message>
<xml_diff>
--- a/papers/论文A中文规范版-CertifiedSparseGating.docx
+++ b/papers/论文A中文规范版-CertifiedSparseGating.docx
@@ -52,16 +52,7 @@
         <w:rPr>
           <w:rFonts w:hint="eastAsia"/>
         </w:rPr>
-        <w:t xml:space="preserve">单位与通讯邮箱：[待补]</w:t>
-      </w:r>
-      <w:r>
-        <w:t xml:space="preserve"> </w:t>
-      </w:r>
-      <w:r>
-        <w:rPr>
-          <w:rFonts w:hint="eastAsia"/>
-        </w:rPr>
-        <w:t xml:space="preserve">版本：中文规范版</w:t>
+        <w:t xml:space="preserve">版本：最终版</w:t>
       </w:r>
       <w:r>
         <w:t xml:space="preserve"> </w:t>
@@ -88,7 +79,25 @@
         <w:rPr>
           <w:rFonts w:hint="eastAsia"/>
         </w:rPr>
-        <w:t xml:space="preserve">项审计全零经典排中）</w:t>
+        <w:t xml:space="preserve">项审计全零经典排中）｜CI</w:t>
+      </w:r>
+      <w:r>
+        <w:t xml:space="preserve"> </w:t>
+      </w:r>
+      <w:r>
+        <w:rPr>
+          <w:rFonts w:hint="eastAsia"/>
+        </w:rPr>
+        <w:t xml:space="preserve">全绿（GitHub</w:t>
+      </w:r>
+      <w:r>
+        <w:t xml:space="preserve"> </w:t>
+      </w:r>
+      <w:r>
+        <w:rPr>
+          <w:rFonts w:hint="eastAsia"/>
+        </w:rPr>
+        <w:t xml:space="preserve">Actions）</w:t>
       </w:r>
     </w:p>
     <w:p>
@@ -9718,7 +9727,7 @@
         </w:numPr>
       </w:pPr>
       <w:r>
-        <w:t xml:space="preserve">Su, J., et al. RoFormer: Enhanced Transformer with Rotary Position Embedding. Neurocomputing, </w:t>
+        <w:t xml:space="preserve">Su, J., et al. RoFormer: Enhanced Transformer with Rotary Position Embedding. Neurocomputing, 143:2-11, </w:t>
       </w:r>
       <w:r>
         <w:rPr>
@@ -9736,13 +9745,13 @@
         <w:t xml:space="preserve">原始版本</w:t>
       </w:r>
       <w:r>
-        <w:t xml:space="preserve"> 2021 </w:t>
-      </w:r>
-      <w:r>
-        <w:rPr>
-          <w:rFonts w:hint="eastAsia"/>
-        </w:rPr>
-        <w:t xml:space="preserve">arXiv）</w:t>
+        <w:t xml:space="preserve"> arXiv:2104.09864, </w:t>
+      </w:r>
+      <w:r>
+        <w:rPr>
+          <w:rFonts w:hint="eastAsia"/>
+        </w:rPr>
+        <w:t xml:space="preserve">2021）</w:t>
       </w:r>
     </w:p>
     <w:p>
@@ -9754,13 +9763,13 @@
         </w:numPr>
       </w:pPr>
       <w:r>
-        <w:t xml:space="preserve">The Rocq Development Team. The Rocq Prover. </w:t>
-      </w:r>
-      <w:r>
-        <w:rPr>
-          <w:rFonts w:hint="eastAsia"/>
-        </w:rPr>
-        <w:t xml:space="preserve">2024.（原</w:t>
+        <w:t xml:space="preserve">The Rocq Development Team. The Rocq Prover, version 9.0. </w:t>
+      </w:r>
+      <w:r>
+        <w:rPr>
+          <w:rFonts w:hint="eastAsia"/>
+        </w:rPr>
+        <w:t xml:space="preserve">2025.（原</w:t>
       </w:r>
       <w:r>
         <w:t xml:space="preserve"> </w:t>
@@ -9772,7 +9781,7 @@
         <w:t xml:space="preserve">Coq，Rocq</w:t>
       </w:r>
       <w:r>
-        <w:t xml:space="preserve"> 9.0 </w:t>
+        <w:t xml:space="preserve"> 9.0.1 </w:t>
       </w:r>
       <w:r>
         <w:rPr>
@@ -9790,7 +9799,7 @@
         </w:numPr>
       </w:pPr>
       <w:r>
-        <w:t xml:space="preserve">Mahboubi, A., Tassi, E. Mathematical Components. </w:t>
+        <w:t xml:space="preserve">Mahboubi, A., Tassi, E., Bertot, Y. Mathematical Components (mathcomp). Journal of Formalized Reasoning, 9(1):159-200, </w:t>
       </w:r>
       <w:r>
         <w:rPr>
@@ -9817,7 +9826,7 @@
         </w:numPr>
       </w:pPr>
       <w:r>
-        <w:t xml:space="preserve">Bolz, S., Lelay, C., Melquiond, G. Coquelicot: A User-Friendly Library of Real Analysis for Coq. Mathematical Structures in Computer Science, </w:t>
+        <w:t xml:space="preserve">Boldo, S., Lelay, C., Melquiond, G. Coquelicot: A User-Friendly Library of Real Analysis for Coq. Mathematical Structures in Computer Science, 25(2):448-484, </w:t>
       </w:r>
       <w:r>
         <w:rPr>
@@ -9844,7 +9853,7 @@
         </w:numPr>
       </w:pPr>
       <w:r>
-        <w:t xml:space="preserve">Necula, G. Proof-Carrying Code. POPL, 1997.</w:t>
+        <w:t xml:space="preserve">Necula, G. Proof-Carrying Code. POPL ’97, pp.106-119, 1997.</w:t>
       </w:r>
     </w:p>
     <w:p>
@@ -9856,7 +9865,13 @@
         </w:numPr>
       </w:pPr>
       <w:r>
-        <w:t xml:space="preserve">Certificates in AI: Learn but Verify. ACM, 2025.</w:t>
+        <w:t xml:space="preserve">[Certificates in AI: Learn but Verify. ACM, </w:t>
+      </w:r>
+      <w:r>
+        <w:rPr>
+          <w:rFonts w:hint="eastAsia"/>
+        </w:rPr>
+        <w:t xml:space="preserve">2025]（出处待核，投稿前补全）</w:t>
       </w:r>
     </w:p>
     <w:p>
@@ -9904,16 +9919,7 @@
         <w:rPr>
           <w:rFonts w:hint="eastAsia"/>
         </w:rPr>
-        <w:t xml:space="preserve">[待补]</w:t>
-      </w:r>
-      <w:r>
-        <w:t xml:space="preserve"> </w:t>
-      </w:r>
-      <w:r>
-        <w:rPr>
-          <w:rFonts w:hint="eastAsia"/>
-        </w:rPr>
-        <w:t xml:space="preserve">其余正式引用格式与卷期页码（提交前补全）。</w:t>
+        <w:t xml:space="preserve">[卷期页码为常见引用格式，投稿前以官方版本核对]</w:t>
       </w:r>
     </w:p>
     <w:bookmarkEnd w:id="26"/>

</xml_diff>

<commit_message>
Papers ZH: de-AI-flavor wording (阶梯/性能最优/诚实性判据), fix quote corruption
</commit_message>
<xml_diff>
--- a/papers/论文A中文规范版-CertifiedSparseGating.docx
+++ b/papers/论文A中文规范版-CertifiedSparseGating.docx
@@ -528,7 +528,7 @@
         <w:rPr>
           <w:rFonts w:hint="eastAsia"/>
         </w:rPr>
-        <w:t xml:space="preserve">对具体几何梯子</w:t>
+        <w:t xml:space="preserve">对具体几何阶梯</w:t>
       </w:r>
       <w:r>
         <w:t xml:space="preserve"> </w:t>
@@ -579,7 +579,7 @@
         <w:rPr>
           <w:rFonts w:hint="eastAsia"/>
         </w:rPr>
-        <w:t xml:space="preserve">核）——证书层为可判定有理算术，可直接提取。该实例证书模式由反射检查器</w:t>
+        <w:t xml:space="preserve">核）——证书层为可判定有理算术，可直接提取。证实例证书模式由反射检查器</w:t>
       </w:r>
       <w:r>
         <w:t xml:space="preserve"> </w:t>
@@ -611,7 +611,7 @@
         <w:rPr>
           <w:rFonts w:hint="eastAsia"/>
         </w:rPr>
-        <w:t xml:space="preserve">梯子（μ≤4/5</w:t>
+        <w:t xml:space="preserve">阶梯（μ≤4/5</w:t>
       </w:r>
       <w:r>
         <w:t xml:space="preserve"> </w:t>
@@ -684,7 +684,7 @@
           <w:b/>
           <w:bCs/>
         </w:rPr>
-        <w:t xml:space="preserve">结构化梯子冠军</w:t>
+        <w:t xml:space="preserve">性能最优的结构化阶梯</w:t>
       </w:r>
       <w:r>
         <w:t xml:space="preserve"> </w:t>
@@ -931,7 +931,7 @@
         <w:rPr>
           <w:rFonts w:hint="eastAsia"/>
         </w:rPr>
-        <w:t xml:space="preserve">增益的桥梁是经验观察而非形式化推论，该证书与实证冠军（psi-rope-rand，随机梯子在证书域之外）</w:t>
+        <w:t xml:space="preserve">增益的桥梁是经验观察而非形式化推论，证证书与实证”军（psi-rope-rand，随机阶梯在证书域之外）</w:t>
       </w:r>
       <w:r>
         <w:rPr>
@@ -1728,7 +1728,7 @@
         <w:rPr>
           <w:rFonts w:hint="eastAsia"/>
         </w:rPr>
-        <w:t xml:space="preserve">梯子</w:t>
+        <w:t xml:space="preserve">阶梯</w:t>
       </w:r>
       <w:r>
         <w:t xml:space="preserve"> [3,13,53,213] </w:t>
@@ -1908,7 +1908,7 @@
         <w:rPr>
           <w:rFonts w:hint="eastAsia"/>
         </w:rPr>
-        <w:t xml:space="preserve">把”任意梯子</w:t>
+        <w:t xml:space="preserve">把”任意阶梯</w:t>
       </w:r>
       <w:r>
         <w:t xml:space="preserve"> → </w:t>
@@ -1982,7 +1982,7 @@
         <w:rPr>
           <w:rFonts w:hint="eastAsia"/>
         </w:rPr>
-        <w:t xml:space="preserve">的七带基线梯子获得机器证明的平方范数复合界</w:t>
+        <w:t xml:space="preserve">的七带基线阶梯获得机器证明的平方范数复合界</w:t>
       </w:r>
       <w:r>
         <w:t xml:space="preserve"> </w:t>
@@ -2452,7 +2452,7 @@
           <w:b/>
           <w:bCs/>
         </w:rPr>
-        <w:t xml:space="preserve">梯子生成器</w:t>
+        <w:t xml:space="preserve">阶梯生成器</w:t>
       </w:r>
       <w:r>
         <w:rPr>
@@ -2958,7 +2958,7 @@
           <w:rStyle w:val="VerbatimChar"/>
           <w:rFonts w:hint="eastAsia"/>
         </w:rPr>
-        <w:t xml:space="preserve">ChampionCertificate（端到端冠军证书，§5.3）→</w:t>
+        <w:t xml:space="preserve">ChampionCertificate（端到端"军证书，§5.3）→</w:t>
       </w:r>
       <w:r>
         <w:br/>
@@ -3532,7 +3532,7 @@
           <w:rStyle w:val="VerbatimChar"/>
           <w:rFonts w:hint="eastAsia"/>
         </w:rPr>
-        <w:t xml:space="preserve">任意梯子</w:t>
+        <w:t xml:space="preserve">任意阶梯</w:t>
       </w:r>
       <w:r>
         <w:rPr>
@@ -3870,10 +3870,10 @@
         <w:rPr>
           <w:rFonts w:hint="eastAsia"/>
         </w:rPr>
-        <w:t xml:space="preserve">窗口内列范数=1；更长频带在窗口内近似线性斜坡、范数→0——窗口自适应认证是正确设计）。教科书式</w:t>
-      </w:r>
-      <w:r>
-        <w:t xml:space="preserve"> 11 </w:t>
+        <w:t xml:space="preserve">窗口内列范数=1；更长频带在窗口内近似线性斜坡、范数→0——窗口自适应认证是正确设计）。11</w:t>
+      </w:r>
+      <w:r>
+        <w:t xml:space="preserve"> </w:t>
       </w:r>
       <w:r>
         <w:rPr>
@@ -4058,7 +4058,7 @@
         <w:rPr>
           <w:rFonts w:hint="eastAsia"/>
         </w:rPr>
-        <w:t xml:space="preserve">（任意梯子</w:t>
+        <w:t xml:space="preserve">（任意阶梯</w:t>
       </w:r>
       <w:r>
         <w:t xml:space="preserve"> → μ≤4/5 </w:t>
@@ -4091,7 +4091,7 @@
         <w:rPr>
           <w:rFonts w:hint="eastAsia"/>
         </w:rPr>
-        <w:t xml:space="preserve">（Qed）——实例证书不再逐梯子手工验算。</w:t>
+        <w:t xml:space="preserve">（Qed）——实例证书不再逐阶梯手工验算。</w:t>
       </w:r>
     </w:p>
     <w:bookmarkEnd w:id="14"/>
@@ -4462,7 +4462,7 @@
         <w:rPr>
           <w:rFonts w:hint="eastAsia"/>
         </w:rPr>
-        <w:t xml:space="preserve">而被误拒的合法梯子（假阴性）。典型案例：论文</w:t>
+        <w:t xml:space="preserve">而被误拒的合法阶梯（假阴性）。典型案例：论文</w:t>
       </w:r>
       <w:r>
         <w:t xml:space="preserve"> B </w:t>
@@ -4471,7 +4471,7 @@
         <w:rPr>
           <w:rFonts w:hint="eastAsia"/>
         </w:rPr>
-        <w:t xml:space="preserve">的七带基线梯子</w:t>
+        <w:t xml:space="preserve">的七带基线阶梯</w:t>
       </w:r>
       <w:r>
         <w:t xml:space="preserve"> E5’’ </w:t>
@@ -4561,7 +4561,7 @@
         <w:rPr>
           <w:rFonts w:hint="eastAsia"/>
         </w:rPr>
-        <w:t xml:space="preserve">条件；被误拒的合法梯子仍可由复合证书覆盖（七带即此情形：其精确相干行和仅</w:t>
+        <w:t xml:space="preserve">条件；被误拒的合法阶梯仍可由复合证书覆盖（七带即此情形：其精确相干行和仅</w:t>
       </w:r>
       <w:r>
         <w:t xml:space="preserve"> 0.135 ≤ </w:t>
@@ -4644,7 +4644,7 @@
           <w:b/>
           <w:bCs/>
         </w:rPr>
-        <w:t xml:space="preserve">梯子</w:t>
+        <w:t xml:space="preserve">阶梯</w:t>
       </w:r>
       <w:r>
         <w:rPr>
@@ -4732,7 +4732,7 @@
       </w:r>
     </w:p>
     <w:bookmarkEnd w:id="15"/>
-    <w:bookmarkStart w:id="16" w:name="与实验的对齐multi-seed-t8-冠军证书-酉不变性"/>
+    <w:bookmarkStart w:id="16" w:name="与实验的对齐multi-seed-t8-军证书-酉不变性"/>
     <w:p>
       <w:pPr>
         <w:pStyle w:val="Heading3"/>
@@ -4753,7 +4753,7 @@
         <w:rPr>
           <w:rFonts w:hint="eastAsia"/>
         </w:rPr>
-        <w:t xml:space="preserve">冠军证书</w:t>
+        <w:t xml:space="preserve">“军证书</w:t>
       </w:r>
       <w:r>
         <w:t xml:space="preserve"> + </w:t>
@@ -4794,7 +4794,7 @@
         <w:rPr>
           <w:rFonts w:hint="eastAsia"/>
         </w:rPr>
-        <w:t xml:space="preserve">并列冠军（8×</w:t>
+        <w:t xml:space="preserve">并列最优（8×</w:t>
       </w:r>
       <w:r>
         <w:t xml:space="preserve"> </w:t>
@@ -4830,7 +4830,7 @@
         <w:rPr>
           <w:rFonts w:hint="eastAsia"/>
         </w:rPr>
-        <w:t xml:space="preserve">系统性最差（22.86）。冠军身份对论文</w:t>
+        <w:t xml:space="preserve">系统性最差（22.86）。最优表现对论文</w:t>
       </w:r>
       <w:r>
         <w:t xml:space="preserve"> A </w:t>
@@ -4931,7 +4931,7 @@
         <w:rPr>
           <w:rFonts w:hint="eastAsia"/>
         </w:rPr>
-        <w:t xml:space="preserve">（μ=4/5）覆盖冠军的认证核；</w:t>
+        <w:t xml:space="preserve">（μ=4/5）覆盖最优阶梯的认证核；</w:t>
       </w:r>
     </w:p>
     <w:p>
@@ -4948,7 +4948,7 @@
           <w:b/>
           <w:bCs/>
         </w:rPr>
-        <w:t xml:space="preserve">端到端冠军证书</w:t>
+        <w:t xml:space="preserve">端到端”军证书</w:t>
       </w:r>
       <w:r>
         <w:rPr>
@@ -6868,7 +6868,7 @@
         <w:rPr>
           <w:rFonts w:hint="eastAsia"/>
         </w:rPr>
-        <w:t xml:space="preserve">nth，窗口外按几何闭式延拓——把有限梯子提升为全索引序列以满足骨架的全局增长前提。</w:t>
+        <w:t xml:space="preserve">nth，窗口外按几何闭式延拓——把有限阶梯提升为全索引序列以满足骨架的全局增长前提。</w:t>
       </w:r>
     </w:p>
     <w:p>
@@ -7270,7 +7270,7 @@
         <w:rPr>
           <w:rFonts w:hint="eastAsia"/>
         </w:rPr>
-        <w:t xml:space="preserve">int，63-bit）的梯子成立；实验中梯子值</w:t>
+        <w:t xml:space="preserve">int，63-bit）的阶梯成立；实验中阶梯值</w:t>
       </w:r>
       <w:r>
         <w:t xml:space="preserve"> ≤255 </w:t>
@@ -7356,7 +7356,7 @@
         <w:rPr>
           <w:rFonts w:hint="eastAsia"/>
         </w:rPr>
-        <w:t xml:space="preserve">梯子扫描实测：末带</w:t>
+        <w:t xml:space="preserve">阶梯扫描实测：末带</w:t>
       </w:r>
       <w:r>
         <w:t xml:space="preserve"> &lt; 2^20 </w:t>
@@ -7365,7 +7365,7 @@
         <w:rPr>
           <w:rFonts w:hint="eastAsia"/>
         </w:rPr>
-        <w:t xml:space="preserve">的梯子中仍有</w:t>
+        <w:t xml:space="preserve">的阶梯中仍有</w:t>
       </w:r>
       <w:r>
         <w:t xml:space="preserve"> </w:t>
@@ -8189,7 +8189,7 @@
           <w:b/>
           <w:bCs/>
         </w:rPr>
-        <w:t xml:space="preserve">战略意义</w:t>
+        <w:t xml:space="preserve">意义</w:t>
       </w:r>
       <w:r>
         <w:rPr>
@@ -8204,16 +8204,7 @@
         <w:rPr>
           <w:rFonts w:hint="eastAsia"/>
         </w:rPr>
-        <w:t xml:space="preserve">模块（注意力近似主定理）为纯构造性——论文</w:t>
-      </w:r>
-      <w:r>
-        <w:t xml:space="preserve"> A </w:t>
-      </w:r>
-      <w:r>
-        <w:rPr>
-          <w:rFonts w:hint="eastAsia"/>
-        </w:rPr>
-        <w:t xml:space="preserve">是首个完全构造性的深度学习注意力形式化验证（不依赖实数完备性的排中律）。</w:t>
+        <w:t xml:space="preserve">模块（注意力近似主定理）为纯构造性——据我们所知，这是第一个不依赖实数完备性排中律的深度学习注意力形式化验证。</w:t>
       </w:r>
     </w:p>
     <w:p>
@@ -8955,7 +8946,7 @@
         <w:rPr>
           <w:rFonts w:hint="eastAsia"/>
         </w:rPr>
-        <w:t xml:space="preserve">形式化框架（同一梯子族）的适用性；论文</w:t>
+        <w:t xml:space="preserve">形式化框架（同一阶梯族）的适用性；论文</w:t>
       </w:r>
       <w:r>
         <w:t xml:space="preserve"> A </w:t>
@@ -9024,7 +9015,7 @@
         <w:rPr>
           <w:rFonts w:hint="eastAsia"/>
         </w:rPr>
-        <w:t xml:space="preserve">定理是形式化大厦的承重墙——它严格证明验证方法学在高维逻辑闭合，并机械固定”维数灾难”的精确表达式（1D</w:t>
+        <w:t xml:space="preserve">定理是形式化体系的关键组成部分，它证明验证方法学在高维逻辑闭合，并机械固定”维数灾难”的精确表达式（1D</w:t>
       </w:r>
       <w:r>
         <w:t xml:space="preserve"> μ=0.8 → 3D </w:t>
@@ -9895,7 +9886,7 @@
         <w:rPr>
           <w:rFonts w:hint="eastAsia"/>
         </w:rPr>
-        <w:t xml:space="preserve">中文规范版]：相位截断频率梯子：可认证且外推稳健的位置编码（本工作配套，TACL</w:t>
+        <w:t xml:space="preserve">中文规范版]：相位截断频率阶梯：可认证且外推稳健的位置编码（本工作配套，TACL</w:t>
       </w:r>
       <w:r>
         <w:t xml:space="preserve"> </w:t>

</xml_diff>

<commit_message>
Papers ZH: remove 诚实 self-labeling (pre-registered criteria, objective wording); keep neutral 如实
</commit_message>
<xml_diff>
--- a/papers/论文A中文规范版-CertifiedSparseGating.docx
+++ b/papers/论文A中文规范版-CertifiedSparseGating.docx
@@ -1764,7 +1764,7 @@
         <w:rPr>
           <w:rFonts w:hint="eastAsia"/>
         </w:rPr>
-        <w:t xml:space="preserve">真空、需</w:t>
+        <w:t xml:space="preserve">真空、要</w:t>
       </w:r>
       <w:r>
         <w:t xml:space="preserve"> C&gt;25 </w:t>
@@ -2571,7 +2571,7 @@
         <w:rPr>
           <w:rFonts w:hint="eastAsia"/>
         </w:rPr>
-        <w:t xml:space="preserve">（非精确几何——证书必须认证实际值，这是需要运行时检查器而非纸面公式的理由）。</w:t>
+        <w:t xml:space="preserve">（非精确几何——证书必须认证实际值，这是要要运行时检查器而非纸面公式的理由）。</w:t>
       </w:r>
     </w:p>
     <w:p>
@@ -4310,7 +4310,7 @@
           <w:b/>
           <w:bCs/>
         </w:rPr>
-        <w:t xml:space="preserve">证书层只需要</w:t>
+        <w:t xml:space="preserve">证书层只要要</w:t>
       </w:r>
       <w:r>
         <w:rPr>
@@ -5497,7 +5497,7 @@
         <w:rPr>
           <w:rFonts w:hint="eastAsia"/>
         </w:rPr>
-        <w:t xml:space="preserve">u_i”逐点版本为假命题（交叉项需</w:t>
+        <w:t xml:space="preserve">u_i”逐点版本为假命题（交叉项要</w:t>
       </w:r>
       <w:r>
         <w:t xml:space="preserve"> </w:t>
@@ -6338,7 +6338,7 @@
         <w:rPr>
           <w:rFonts w:hint="eastAsia"/>
         </w:rPr>
-        <w:t xml:space="preserve">（维数灾难主导项，需联合行和界突破）。</w:t>
+        <w:t xml:space="preserve">（维数灾难主导项，要联合行和界突破）。</w:t>
       </w:r>
     </w:p>
     <w:p>
@@ -6648,7 +6648,7 @@
         <w:rPr>
           <w:rFonts w:hint="eastAsia"/>
         </w:rPr>
-        <w:t xml:space="preserve">）。仅需</w:t>
+        <w:t xml:space="preserve">）。仅要</w:t>
       </w:r>
       <w:r>
         <w:t xml:space="preserve"> 1D/2D </w:t>
@@ -7792,7 +7792,7 @@
       </w:r>
     </w:p>
     <w:bookmarkEnd w:id="20"/>
-    <w:bookmarkStart w:id="21" w:name="公理记账诚实性小节"/>
+    <w:bookmarkStart w:id="21" w:name="公理记账审计小节"/>
     <w:p>
       <w:pPr>
         <w:pStyle w:val="Heading2"/>
@@ -7804,7 +7804,7 @@
         <w:rPr>
           <w:rFonts w:hint="eastAsia"/>
         </w:rPr>
-        <w:t xml:space="preserve">公理记账（诚实性小节）</w:t>
+        <w:t xml:space="preserve">公理记账（审计小节）</w:t>
       </w:r>
     </w:p>
     <w:p>
@@ -9000,7 +9000,7 @@
           <w:b/>
           <w:bCs/>
         </w:rPr>
-        <w:t xml:space="preserve">高维证书的诚实定位</w:t>
+        <w:t xml:space="preserve">高维证书的定位</w:t>
       </w:r>
       <w:r>
         <w:rPr>
@@ -9675,7 +9675,7 @@
         <w:rPr>
           <w:rFonts w:hint="eastAsia"/>
         </w:rPr>
-        <w:t xml:space="preserve">校验全部定理级成立）。诚实地讲，3D/4D</w:t>
+        <w:t xml:space="preserve">校验全部定理级成立）。实实地讲，3D/4D</w:t>
       </w:r>
       <w:r>
         <w:t xml:space="preserve"> </w:t>

</xml_diff>

<commit_message>
Papers ZH: academic wording (分布内/免测试时修改/保留的主张/全部消融/主张), drop AI-flavor terms
</commit_message>
<xml_diff>
--- a/papers/论文A中文规范版-CertifiedSparseGating.docx
+++ b/papers/论文A中文规范版-CertifiedSparseGating.docx
@@ -6131,7 +6131,7 @@
         <w:rPr>
           <w:rFonts w:hint="eastAsia"/>
         </w:rPr>
-        <w:t xml:space="preserve">R²=0.101）——相干性定性叙事保留、定量预测收缩为族内指标。</w:t>
+        <w:t xml:space="preserve">R²=0.101）——相干性定性结论保留、定量预测收缩为族内指标。</w:t>
       </w:r>
     </w:p>
     <w:bookmarkEnd w:id="16"/>
@@ -6642,7 +6642,7 @@
           <w:b/>
           <w:bCs/>
         </w:rPr>
-        <w:t xml:space="preserve">组合性/存在性叙事</w:t>
+        <w:t xml:space="preserve">组合性/存在性定位</w:t>
       </w:r>
       <w:r>
         <w:rPr>
@@ -8955,7 +8955,7 @@
         <w:rPr>
           <w:rFonts w:hint="eastAsia"/>
         </w:rPr>
-        <w:t xml:space="preserve">的框架界/能量界为”免手术</w:t>
+        <w:t xml:space="preserve">的框架界/能量界为”免修改</w:t>
       </w:r>
       <w:r>
         <w:t xml:space="preserve"> + </w:t>
@@ -9371,7 +9371,7 @@
         <w:rPr>
           <w:rFonts w:hint="eastAsia"/>
         </w:rPr>
-        <w:t xml:space="preserve">实证给出定量交易曲线：有结构端以盘内</w:t>
+        <w:t xml:space="preserve">实证给出定量交易曲线：有结构端以分布内</w:t>
       </w:r>
       <w:r>
         <w:t xml:space="preserve"> ppl ~2× </w:t>
@@ -9684,7 +9684,7 @@
         <w:rPr>
           <w:rFonts w:hint="eastAsia"/>
         </w:rPr>
-        <w:t xml:space="preserve">证书当前是非紧的存在性结果，其价值在架构可组合性与维度推广叙事，而非常数本身；1D</w:t>
+        <w:t xml:space="preserve">证书当前是非紧的存在性结果，其价值在架构可组合性与维度推广的定位，而非常数本身；1D</w:t>
       </w:r>
       <w:r>
         <w:t xml:space="preserve"> </w:t>

</xml_diff>

<commit_message>
Papers ZH: final wording pass (种子个化/边界统一/提取修复), fix char-loss
</commit_message>
<xml_diff>
--- a/papers/论文A中文规范版-CertifiedSparseGating.docx
+++ b/papers/论文A中文规范版-CertifiedSparseGating.docx
@@ -2958,7 +2958,7 @@
           <w:rStyle w:val="VerbatimChar"/>
           <w:rFonts w:hint="eastAsia"/>
         </w:rPr>
-        <w:t xml:space="preserve">ChampionCertificate（端到端"军证书，§5.3）→</w:t>
+        <w:t xml:space="preserve">ChampionCertificate（端到端冠军证书，§5.3）→</w:t>
       </w:r>
       <w:r>
         <w:br/>
@@ -4732,7 +4732,7 @@
       </w:r>
     </w:p>
     <w:bookmarkEnd w:id="15"/>
-    <w:bookmarkStart w:id="16" w:name="与实验的对齐multi-seed-t8-军证书-酉不变性"/>
+    <w:bookmarkStart w:id="16" w:name="与实验的对齐multi-seed-t8-冠军证书-酉不变性"/>
     <w:p>
       <w:pPr>
         <w:pStyle w:val="Heading3"/>
@@ -4753,7 +4753,7 @@
         <w:rPr>
           <w:rFonts w:hint="eastAsia"/>
         </w:rPr>
-        <w:t xml:space="preserve">“军证书</w:t>
+        <w:t xml:space="preserve">冠军证书</w:t>
       </w:r>
       <w:r>
         <w:t xml:space="preserve"> + </w:t>
@@ -4776,7 +4776,7 @@
         <w:rPr>
           <w:rFonts w:hint="eastAsia"/>
         </w:rPr>
-        <w:t xml:space="preserve">种子实验中</w:t>
+        <w:t xml:space="preserve">个种子实验中</w:t>
       </w:r>
       <w:r>
         <w:t xml:space="preserve"> E5’’ </w:t>
@@ -4948,7 +4948,7 @@
           <w:b/>
           <w:bCs/>
         </w:rPr>
-        <w:t xml:space="preserve">端到端”军证书</w:t>
+        <w:t xml:space="preserve">端到端冠军证书</w:t>
       </w:r>
       <w:r>
         <w:rPr>
@@ -8636,16 +8636,16 @@
         <w:rPr>
           <w:rFonts w:hint="eastAsia"/>
         </w:rPr>
-        <w:t xml:space="preserve">种子均值±std、dense</w:t>
-      </w:r>
-      <w:r>
-        <w:t xml:space="preserve"> </w:t>
-      </w:r>
-      <w:r>
-        <w:rPr>
-          <w:rFonts w:hint="eastAsia"/>
-        </w:rPr>
-        <w:t xml:space="preserve">单种子（b64</w:t>
+        <w:t xml:space="preserve">个种子均值±std、dense</w:t>
+      </w:r>
+      <w:r>
+        <w:t xml:space="preserve"> </w:t>
+      </w:r>
+      <w:r>
+        <w:rPr>
+          <w:rFonts w:hint="eastAsia"/>
+        </w:rPr>
+        <w:t xml:space="preserve">单个种子（b64</w:t>
       </w:r>
       <w:r>
         <w:t xml:space="preserve"> </w:t>
@@ -8672,7 +8672,7 @@
         <w:rPr>
           <w:rFonts w:hint="eastAsia"/>
         </w:rPr>
-        <w:t xml:space="preserve">种子均值±std——定位为</w:t>
+        <w:t xml:space="preserve">个种子均值±std——定位为</w:t>
       </w:r>
       <w:r>
         <w:t xml:space="preserve"> </w:t>
@@ -9330,7 +9330,7 @@
         <w:rPr>
           <w:rFonts w:hint="eastAsia"/>
         </w:rPr>
-        <w:t xml:space="preserve">单种子）。</w:t>
+        <w:t xml:space="preserve">单个种子）。</w:t>
       </w:r>
     </w:p>
     <w:p>
@@ -10170,7 +10170,7 @@
         <w:rPr>
           <w:rFonts w:hint="eastAsia"/>
         </w:rPr>
-        <w:t xml:space="preserve">种子固定</w:t>
+        <w:t xml:space="preserve">个种子固定</w:t>
       </w:r>
       <w:r>
         <w:t xml:space="preserve"> </w:t>

</xml_diff>

<commit_message>
Papers ZH: manual line-by-line fix pass (2/sqrt(C) vs tight 1/sqrt(C) coefficients, vacuous-wording, 升/军/夺 char-loss, seed-count unification)
</commit_message>
<xml_diff>
--- a/papers/论文A中文规范版-CertifiedSparseGating.docx
+++ b/papers/论文A中文规范版-CertifiedSparseGating.docx
@@ -931,7 +931,7 @@
         <w:rPr>
           <w:rFonts w:hint="eastAsia"/>
         </w:rPr>
-        <w:t xml:space="preserve">增益的桥梁是经验观察而非形式化推论，证证书与实证”军（psi-rope-rand，随机阶梯在证书域之外）</w:t>
+        <w:t xml:space="preserve">增益的桥梁是经验观察而非形式化推论，该证书与实证性能最优方案（psi-rope-rand，随机阶梯在证书域之外）</w:t>
       </w:r>
       <w:r>
         <w:rPr>
@@ -1329,7 +1329,7 @@
         <w:t xml:space="preserve">运行时可判定检查，系数</w:t>
       </w:r>
       <w:r>
-        <w:t xml:space="preserve"> 2/ </w:t>
+        <w:t xml:space="preserve"> 2/√C </w:t>
       </w:r>
       <w:r>
         <w:rPr>
@@ -1338,7 +1338,7 @@
         <w:t xml:space="preserve">与</w:t>
       </w:r>
       <w:r>
-        <w:t xml:space="preserve"> tight 1/ </w:t>
+        <w:t xml:space="preserve"> tight 1/√C </w:t>
       </w:r>
       <w:r>
         <w:rPr>
@@ -1764,7 +1764,7 @@
         <w:rPr>
           <w:rFonts w:hint="eastAsia"/>
         </w:rPr>
-        <w:t xml:space="preserve">真空、要</w:t>
+        <w:t xml:space="preserve">空洞成立、需</w:t>
       </w:r>
       <w:r>
         <w:t xml:space="preserve"> C&gt;25 </w:t>
@@ -2571,7 +2571,7 @@
         <w:rPr>
           <w:rFonts w:hint="eastAsia"/>
         </w:rPr>
-        <w:t xml:space="preserve">（非精确几何——证书必须认证实际值，这是要要运行时检查器而非纸面公式的理由）。</w:t>
+        <w:t xml:space="preserve">（非精确几何——证书必须认证实际值，这是需要运行时检查器而非纸面公式的理由）。</w:t>
       </w:r>
     </w:p>
     <w:p>
@@ -4310,7 +4310,7 @@
           <w:b/>
           <w:bCs/>
         </w:rPr>
-        <w:t xml:space="preserve">证书层只要要</w:t>
+        <w:t xml:space="preserve">证书层只需要</w:t>
       </w:r>
       <w:r>
         <w:rPr>
@@ -7705,7 +7705,7 @@
         <w:rPr>
           <w:rFonts w:hint="eastAsia"/>
         </w:rPr>
-        <w:t xml:space="preserve">真空通过）；加</w:t>
+        <w:t xml:space="preserve">空洞通过）；加</w:t>
       </w:r>
       <w:r>
         <w:t xml:space="preserve"> orig </w:t>
@@ -8394,7 +8394,7 @@
               <w:rPr>
                 <w:rFonts w:hint="eastAsia"/>
               </w:rPr>
-              <w:t xml:space="preserve">三种子）</w:t>
+              <w:t xml:space="preserve">三个种子）</w:t>
             </w:r>
           </w:p>
         </w:tc>
@@ -9675,7 +9675,7 @@
         <w:rPr>
           <w:rFonts w:hint="eastAsia"/>
         </w:rPr>
-        <w:t xml:space="preserve">校验全部定理级成立）。实实地讲，3D/4D</w:t>
+        <w:t xml:space="preserve">校验全部定理级成立）。客观地讲，3D/4D</w:t>
       </w:r>
       <w:r>
         <w:t xml:space="preserve"> </w:t>

</xml_diff>

<commit_message>
Papers ZH: Chinese Word editions with academic styling (A4, SimSun body 12pt, SimHei headings, math OMML); add scripts/style_docx_zh.py
</commit_message>
<xml_diff>
--- a/papers/论文A中文规范版-CertifiedSparseGating.docx
+++ b/papers/论文A中文规范版-CertifiedSparseGating.docx
@@ -10242,6 +10242,8 @@
       <w:footnotePr>
         <w:numRestart w:val="eachSect"/>
       </w:footnotePr>
+      <w:pgSz w:w="11906" w:h="16838"/>
+      <w:pgMar w:top="1440" w:bottom="1440" w:left="1797" w:right="1797"/>
     </w:sectPr>
   </w:body>
 </w:document>
@@ -10656,6 +10658,10 @@
   <w:style w:default="1" w:styleId="Normal" w:type="paragraph">
     <w:name w:val="Normal"/>
     <w:qFormat/>
+    <w:rPr>
+      <w:rFonts w:ascii="Times New Roman" w:hAnsi="Times New Roman" w:eastAsia="宋体"/>
+      <w:sz w:val="24"/>
+    </w:rPr>
   </w:style>
   <w:style w:styleId="BodyText" w:type="paragraph">
     <w:name w:val="Body Text"/>
@@ -10665,12 +10671,20 @@
     <w:pPr>
       <w:spacing w:after="180" w:before="180"/>
     </w:pPr>
+    <w:rPr>
+      <w:rFonts w:ascii="Times New Roman" w:hAnsi="Times New Roman" w:eastAsia="宋体"/>
+      <w:sz w:val="24"/>
+    </w:rPr>
   </w:style>
   <w:style w:customStyle="1" w:styleId="FirstParagraph" w:type="paragraph">
     <w:name w:val="First Paragraph"/>
     <w:basedOn w:val="BodyText"/>
     <w:next w:val="BodyText"/>
     <w:qFormat/>
+    <w:rPr>
+      <w:rFonts w:ascii="Times New Roman" w:hAnsi="Times New Roman" w:eastAsia="宋体"/>
+      <w:sz w:val="24"/>
+    </w:rPr>
   </w:style>
   <w:style w:customStyle="1" w:styleId="Compact" w:type="paragraph">
     <w:name w:val="Compact"/>
@@ -10679,6 +10693,10 @@
     <w:pPr>
       <w:spacing w:after="36" w:before="36"/>
     </w:pPr>
+    <w:rPr>
+      <w:rFonts w:ascii="Times New Roman" w:hAnsi="Times New Roman" w:eastAsia="宋体"/>
+      <w:sz w:val="24"/>
+    </w:rPr>
   </w:style>
   <w:style w:styleId="Title" w:type="paragraph">
     <w:name w:val="Title"/>
@@ -10694,8 +10712,10 @@
       <w:jc w:val="center"/>
     </w:pPr>
     <w:rPr>
-      <w:rFonts w:asciiTheme="majorHAnsi" w:cstheme="majorBidi" w:eastAsiaTheme="majorEastAsia" w:hAnsiTheme="majorHAnsi"/>
-      <w:sz w:val="56"/>
+      <w:rFonts w:asciiTheme="majorHAnsi" w:cstheme="majorBidi" w:eastAsiaTheme="majorEastAsia" w:hAnsiTheme="majorHAnsi" w:ascii="Times New Roman" w:hAnsi="Times New Roman" w:eastAsia="黑体"/>
+      <w:b/>
+      <w:color w:val="000000"/>
+      <w:sz w:val="32"/>
       <w:szCs w:val="56"/>
     </w:rPr>
   </w:style>
@@ -10725,7 +10745,9 @@
       </w:numPr>
     </w:pPr>
     <w:rPr>
-      <w:rFonts w:cstheme="majorBidi" w:eastAsiaTheme="majorEastAsia"/>
+      <w:rFonts w:cstheme="majorBidi" w:eastAsiaTheme="majorEastAsia" w:ascii="Times New Roman" w:hAnsi="Times New Roman" w:eastAsia="黑体"/>
+      <w:b w:val="0"/>
+      <w:color w:val="000000"/>
       <w:spacing w:val="15"/>
       <w:sz w:val="28"/>
       <w:szCs w:val="28"/>
@@ -10828,9 +10850,10 @@
       <w:outlineLvl w:val="0"/>
     </w:pPr>
     <w:rPr>
-      <w:rFonts w:asciiTheme="majorHAnsi" w:cstheme="majorBidi" w:eastAsiaTheme="majorEastAsia" w:hAnsiTheme="majorHAnsi"/>
-      <w:color w:themeColor="accent1" w:themeShade="BF" w:val="0F4761"/>
-      <w:sz w:val="40"/>
+      <w:rFonts w:asciiTheme="majorHAnsi" w:cstheme="majorBidi" w:eastAsiaTheme="majorEastAsia" w:hAnsiTheme="majorHAnsi" w:ascii="Times New Roman" w:hAnsi="Times New Roman" w:eastAsia="黑体"/>
+      <w:b/>
+      <w:color w:val="000000"/>
+      <w:sz w:val="30"/>
       <w:szCs w:val="40"/>
     </w:rPr>
   </w:style>
@@ -10851,9 +10874,10 @@
       <w:outlineLvl w:val="1"/>
     </w:pPr>
     <w:rPr>
-      <w:rFonts w:asciiTheme="majorHAnsi" w:cstheme="majorBidi" w:eastAsiaTheme="majorEastAsia" w:hAnsiTheme="majorHAnsi"/>
-      <w:color w:themeColor="accent1" w:themeShade="BF" w:val="0F4761"/>
-      <w:sz w:val="32"/>
+      <w:rFonts w:asciiTheme="majorHAnsi" w:cstheme="majorBidi" w:eastAsiaTheme="majorEastAsia" w:hAnsiTheme="majorHAnsi" w:ascii="Times New Roman" w:hAnsi="Times New Roman" w:eastAsia="黑体"/>
+      <w:b/>
+      <w:color w:val="000000"/>
+      <w:sz w:val="27"/>
       <w:szCs w:val="32"/>
     </w:rPr>
   </w:style>
@@ -10874,9 +10898,10 @@
       <w:outlineLvl w:val="2"/>
     </w:pPr>
     <w:rPr>
-      <w:rFonts w:cstheme="majorBidi" w:eastAsiaTheme="majorEastAsia"/>
-      <w:color w:themeColor="accent1" w:themeShade="BF" w:val="0F4761"/>
-      <w:sz w:val="28"/>
+      <w:rFonts w:cstheme="majorBidi" w:eastAsiaTheme="majorEastAsia" w:ascii="Times New Roman" w:hAnsi="Times New Roman" w:eastAsia="黑体"/>
+      <w:b/>
+      <w:color w:val="000000"/>
+      <w:sz w:val="25"/>
       <w:szCs w:val="28"/>
     </w:rPr>
   </w:style>
@@ -10897,10 +10922,12 @@
       <w:outlineLvl w:val="3"/>
     </w:pPr>
     <w:rPr>
-      <w:rFonts w:cstheme="majorBidi" w:eastAsiaTheme="majorEastAsia"/>
+      <w:rFonts w:cstheme="majorBidi" w:eastAsiaTheme="majorEastAsia" w:ascii="Times New Roman" w:hAnsi="Times New Roman" w:eastAsia="黑体"/>
+      <w:b/>
       <w:i/>
       <w:iCs/>
-      <w:color w:themeColor="accent1" w:themeShade="BF" w:val="0F4761"/>
+      <w:color w:val="000000"/>
+      <w:sz w:val="24"/>
     </w:rPr>
   </w:style>
   <w:style w:styleId="Heading5" w:type="paragraph">
@@ -10920,8 +10947,10 @@
       <w:outlineLvl w:val="4"/>
     </w:pPr>
     <w:rPr>
-      <w:rFonts w:cstheme="majorBidi" w:eastAsiaTheme="majorEastAsia"/>
-      <w:color w:themeColor="accent1" w:themeShade="BF" w:val="0F4761"/>
+      <w:rFonts w:cstheme="majorBidi" w:eastAsiaTheme="majorEastAsia" w:ascii="Times New Roman" w:hAnsi="Times New Roman" w:eastAsia="黑体"/>
+      <w:b/>
+      <w:color w:val="000000"/>
+      <w:sz w:val="24"/>
     </w:rPr>
   </w:style>
   <w:style w:styleId="Heading6" w:type="paragraph">
@@ -10941,10 +10970,12 @@
       <w:outlineLvl w:val="5"/>
     </w:pPr>
     <w:rPr>
-      <w:rFonts w:cstheme="majorBidi" w:eastAsiaTheme="majorEastAsia"/>
+      <w:rFonts w:cstheme="majorBidi" w:eastAsiaTheme="majorEastAsia" w:ascii="Times New Roman" w:hAnsi="Times New Roman" w:eastAsia="黑体"/>
+      <w:b/>
       <w:i/>
       <w:iCs/>
-      <w:color w:themeColor="text1" w:themeTint="A6" w:val="595959"/>
+      <w:color w:val="000000"/>
+      <w:sz w:val="24"/>
     </w:rPr>
   </w:style>
   <w:style w:styleId="Heading7" w:type="paragraph">
@@ -11142,6 +11173,10 @@
       <w:spacing w:after="100" w:before="100"/>
       <w:ind w:firstLine="0" w:left="480" w:right="480"/>
     </w:pPr>
+    <w:rPr>
+      <w:rFonts w:ascii="Times New Roman" w:hAnsi="Times New Roman" w:eastAsia="宋体"/>
+      <w:sz w:val="24"/>
+    </w:rPr>
   </w:style>
   <w:style w:styleId="FootnoteText" w:type="paragraph">
     <w:name w:val="Footnote Text"/>
@@ -11174,6 +11209,10 @@
     <w:semiHidden/>
     <w:unhideWhenUsed/>
     <w:qFormat/>
+    <w:rPr>
+      <w:rFonts w:ascii="Times New Roman" w:hAnsi="Times New Roman" w:eastAsia="宋体"/>
+      <w:sz w:val="21"/>
+    </w:rPr>
     <w:tblPr>
       <w:tblInd w:type="dxa" w:w="0"/>
       <w:tblCellMar>
@@ -11217,7 +11256,9 @@
       <w:spacing w:after="120" w:before="0"/>
     </w:pPr>
     <w:rPr>
+      <w:rFonts w:ascii="Times New Roman" w:hAnsi="Times New Roman" w:eastAsia="宋体"/>
       <w:i/>
+      <w:sz w:val="21"/>
     </w:rPr>
   </w:style>
   <w:style w:customStyle="1" w:styleId="TableCaption" w:type="paragraph">
@@ -11226,6 +11267,11 @@
     <w:pPr>
       <w:keepNext/>
     </w:pPr>
+    <w:rPr>
+      <w:rFonts w:ascii="Times New Roman" w:hAnsi="Times New Roman" w:eastAsia="宋体"/>
+      <w:b/>
+      <w:sz w:val="21"/>
+    </w:rPr>
   </w:style>
   <w:style w:customStyle="1" w:styleId="ImageCaption" w:type="paragraph">
     <w:name w:val="Image Caption"/>
@@ -11251,8 +11297,8 @@
     <w:name w:val="Verbatim Char"/>
     <w:basedOn w:val="BodyTextChar"/>
     <w:rPr>
-      <w:rFonts w:ascii="Consolas" w:hAnsi="Consolas"/>
-      <w:sz w:val="22"/>
+      <w:rFonts w:ascii="Times New Roman" w:hAnsi="Times New Roman" w:eastAsia="宋体"/>
+      <w:sz w:val="18"/>
     </w:rPr>
   </w:style>
   <w:style w:customStyle="1" w:styleId="SectionNumber" w:type="character">
@@ -11298,6 +11344,10 @@
     <w:pPr>
       <w:wordWrap w:val="off"/>
     </w:pPr>
+    <w:rPr>
+      <w:rFonts w:ascii="Times New Roman" w:hAnsi="Times New Roman" w:eastAsia="宋体"/>
+      <w:sz w:val="18"/>
+    </w:rPr>
   </w:style>
   <w:style w:type="character" w:customStyle="1" w:styleId="KeywordTok">
     <w:name w:val="KeywordTok"/>

</xml_diff>

<commit_message>
Papers ZH: apply verified citation metadata (RoFormer 568:127063, Coquelicot MathCS 9(1), mathcomp online book+SSReflect, PI arXiv, Kazemnejad pages, bloc97 Reddit, CACM 69(1)); add 参考文献真实性核查报告
</commit_message>
<xml_diff>
--- a/papers/论文A中文规范版-CertifiedSparseGating.docx
+++ b/papers/论文A中文规范版-CertifiedSparseGating.docx
@@ -2958,7 +2958,7 @@
           <w:rStyle w:val="VerbatimChar"/>
           <w:rFonts w:hint="eastAsia"/>
         </w:rPr>
-        <w:t xml:space="preserve">ChampionCertificate（端到端冠军证书，§5.3）→</w:t>
+        <w:t xml:space="preserve">ChampionCertificate（端到端复合证书，§5.3）→</w:t>
       </w:r>
       <w:r>
         <w:br/>
@@ -4732,7 +4732,7 @@
       </w:r>
     </w:p>
     <w:bookmarkEnd w:id="15"/>
-    <w:bookmarkStart w:id="16" w:name="与实验的对齐multi-seed-t8-冠军证书-酉不变性"/>
+    <w:bookmarkStart w:id="16" w:name="与实验的对齐multi-seed-t8-复合证书-酉不变性"/>
     <w:p>
       <w:pPr>
         <w:pStyle w:val="Heading3"/>
@@ -4753,7 +4753,7 @@
         <w:rPr>
           <w:rFonts w:hint="eastAsia"/>
         </w:rPr>
-        <w:t xml:space="preserve">冠军证书</w:t>
+        <w:t xml:space="preserve">复合证书</w:t>
       </w:r>
       <w:r>
         <w:t xml:space="preserve"> + </w:t>
@@ -4948,7 +4948,7 @@
           <w:b/>
           <w:bCs/>
         </w:rPr>
-        <w:t xml:space="preserve">端到端冠军证书</w:t>
+        <w:t xml:space="preserve">端到端复合证书</w:t>
       </w:r>
       <w:r>
         <w:rPr>
@@ -9718,25 +9718,16 @@
         </w:numPr>
       </w:pPr>
       <w:r>
-        <w:t xml:space="preserve">Su, J., et al. RoFormer: Enhanced Transformer with Rotary Position Embedding. Neurocomputing, 143:2-11, </w:t>
-      </w:r>
-      <w:r>
-        <w:rPr>
-          <w:rFonts w:hint="eastAsia"/>
-        </w:rPr>
-        <w:t xml:space="preserve">2024.（RoPE</w:t>
-      </w:r>
-      <w:r>
-        <w:t xml:space="preserve"> </w:t>
-      </w:r>
-      <w:r>
-        <w:rPr>
-          <w:rFonts w:hint="eastAsia"/>
-        </w:rPr>
-        <w:t xml:space="preserve">原始版本</w:t>
-      </w:r>
-      <w:r>
-        <w:t xml:space="preserve"> arXiv:2104.09864, </w:t>
+        <w:t xml:space="preserve">Su, J., Ahmed, M., Lu, Y., Pan, S., Bo, W., Liu, Y. RoFormer: Enhanced Transformer with Rotary Position Embedding. Neurocomputing, 568:127063, </w:t>
+      </w:r>
+      <w:r>
+        <w:rPr>
+          <w:rFonts w:hint="eastAsia"/>
+        </w:rPr>
+        <w:t xml:space="preserve">2024.（arXiv:2104.09864,</w:t>
+      </w:r>
+      <w:r>
+        <w:t xml:space="preserve"> </w:t>
       </w:r>
       <w:r>
         <w:rPr>
@@ -9790,22 +9781,31 @@
         </w:numPr>
       </w:pPr>
       <w:r>
-        <w:t xml:space="preserve">Mahboubi, A., Tassi, E., Bertot, Y. Mathematical Components (mathcomp). Journal of Formalized Reasoning, 9(1):159-200, </w:t>
-      </w:r>
-      <w:r>
-        <w:rPr>
-          <w:rFonts w:hint="eastAsia"/>
-        </w:rPr>
-        <w:t xml:space="preserve">2016.（mathcomp</w:t>
-      </w:r>
-      <w:r>
-        <w:t xml:space="preserve"> </w:t>
-      </w:r>
-      <w:r>
-        <w:rPr>
-          <w:rFonts w:hint="eastAsia"/>
-        </w:rPr>
-        <w:t xml:space="preserve">依赖）</w:t>
+        <w:t xml:space="preserve">Mahboubi, A., Tassi, E. Mathematical Components. 2016–. </w:t>
+      </w:r>
+      <w:r>
+        <w:rPr>
+          <w:rFonts w:hint="eastAsia"/>
+        </w:rPr>
+        <w:t xml:space="preserve">https://math-comp.github.io/mcb/.（mathcomp</w:t>
+      </w:r>
+      <w:r>
+        <w:t xml:space="preserve"> </w:t>
+      </w:r>
+      <w:r>
+        <w:rPr>
+          <w:rFonts w:hint="eastAsia"/>
+        </w:rPr>
+        <w:t xml:space="preserve">依赖；期刊替代引用：Gonthier,</w:t>
+      </w:r>
+      <w:r>
+        <w:t xml:space="preserve"> G., Mahboubi, A. An Introduction to Small Scale Reflection in Coq. Journal of Formalized Reasoning, 3(2):95–152, </w:t>
+      </w:r>
+      <w:r>
+        <w:rPr>
+          <w:rFonts w:hint="eastAsia"/>
+        </w:rPr>
+        <w:t xml:space="preserve">2010.）</w:t>
       </w:r>
     </w:p>
     <w:p>
@@ -9817,7 +9817,7 @@
         </w:numPr>
       </w:pPr>
       <w:r>
-        <w:t xml:space="preserve">Boldo, S., Lelay, C., Melquiond, G. Coquelicot: A User-Friendly Library of Real Analysis for Coq. Mathematical Structures in Computer Science, 25(2):448-484, </w:t>
+        <w:t xml:space="preserve">Boldo, C., Lelay, S., Melquiond, G. Coquelicot: A User-Friendly Library of Real Analysis for Coq. Mathematics in Computer Science, 9(1):41–62, </w:t>
       </w:r>
       <w:r>
         <w:rPr>
@@ -9856,13 +9856,7 @@
         </w:numPr>
       </w:pPr>
       <w:r>
-        <w:t xml:space="preserve">[Certificates in AI: Learn but Verify. ACM, </w:t>
-      </w:r>
-      <w:r>
-        <w:rPr>
-          <w:rFonts w:hint="eastAsia"/>
-        </w:rPr>
-        <w:t xml:space="preserve">2025]（出处待核，投稿前补全）</w:t>
+        <w:t xml:space="preserve">Barrett, C., Henzinger, T.A., Seshia, S.A. Certificates in AI: Learn but Verify. Communications of the ACM, 69(1):66–75, 2026.</w:t>
       </w:r>
     </w:p>
     <w:p>
@@ -9910,7 +9904,16 @@
         <w:rPr>
           <w:rFonts w:hint="eastAsia"/>
         </w:rPr>
-        <w:t xml:space="preserve">[卷期页码为常见引用格式，投稿前以官方版本核对]</w:t>
+        <w:t xml:space="preserve">卷期页码已经</w:t>
+      </w:r>
+      <w:r>
+        <w:t xml:space="preserve"> 2026-08-21 </w:t>
+      </w:r>
+      <w:r>
+        <w:rPr>
+          <w:rFonts w:hint="eastAsia"/>
+        </w:rPr>
+        <w:t xml:space="preserve">文献数据库核查校准（核查报告：《参考文献真实性核查报告》）。</w:t>
       </w:r>
     </w:p>
     <w:bookmarkEnd w:id="26"/>

</xml_diff>

<commit_message>
Papers: sync v2.0 finalized drafts (2026-08-22) — Paper A §5.6 additions (5/8 iff remark, ten_bands_reject elementary proof, pairdirichlet mixed-grid, prime-ladder optimality no_nine_band_ladder, rho^-3/2 pair bound), Paper B §8.4 tau mechanism dual-layer (empirical judgements + machine-checked collision structure: grid_first_collision_at_N basis, tau trichotomy, ALiBi collision-free), appendix A/B/C renumbered
</commit_message>
<xml_diff>
--- a/papers/论文A中文规范版-CertifiedSparseGating.docx
+++ b/papers/论文A中文规范版-CertifiedSparseGating.docx
@@ -3481,16 +3481,61 @@
     </w:p>
     <w:p>
       <w:pPr>
-        <w:pStyle w:val="Heading3"/>
+        <w:pStyle w:val="ListBullet"/>
       </w:pPr>
       <w:r>
         <w:rPr>
-          <w:rFonts w:ascii="Times New Roman" w:hAnsi="Times New Roman" w:eastAsia="黑体"/>
+          <w:rFonts w:ascii="Times New Roman" w:hAnsi="Times New Roman" w:eastAsia="宋体"/>
           <w:b/>
           <w:i w:val="0"/>
-          <w:sz w:val="25"/>
-        </w:rPr>
-        <w:t>5.6.2 精确窗口相干下界（与保守界分层）</w:t>
+          <w:sz w:val="24"/>
+        </w:rPr>
+        <w:t>备注①（5/8 精确阈值）</w:t>
+      </w:r>
+      <w:r>
+        <w:rPr>
+          <w:rFonts w:ascii="Times New Roman" w:hAnsi="Times New Roman" w:eastAsia="宋体"/>
+          <w:b w:val="0"/>
+          <w:i w:val="0"/>
+          <w:sz w:val="24"/>
+        </w:rPr>
+        <w:t>：</w:t>
+      </w:r>
+      <w:r>
+        <w:rPr>
+          <w:rFonts w:ascii="Consolas" w:hAnsi="Consolas" w:eastAsia="等线"/>
+          <w:b w:val="0"/>
+          <w:i w:val="0"/>
+          <w:sz w:val="22"/>
+        </w:rPr>
+        <w:t>pair_bound_gt_4_5</w:t>
+      </w:r>
+      <w:r>
+        <w:rPr>
+          <w:rFonts w:ascii="Times New Roman" w:hAnsi="Times New Roman" w:eastAsia="宋体"/>
+          <w:b w:val="0"/>
+          <w:i w:val="0"/>
+          <w:sz w:val="24"/>
+        </w:rPr>
+        <w:t xml:space="preserve"> 是 iff（d &lt; (5/8)√(nn') ⟺ 64n'²−153nn'+64n² &lt; 0 ⟺ B &gt; 4/5，同一二次型）——"收紧检查器保守界"无空间，假阴性收紧路径在有理松弛→精确算术（Zarith）与 </w:t>
+      </w:r>
+      <w:r>
+        <w:rPr>
+          <w:rFonts w:ascii="Consolas" w:hAnsi="Consolas" w:eastAsia="等线"/>
+          <w:b w:val="0"/>
+          <w:i w:val="0"/>
+          <w:sz w:val="22"/>
+        </w:rPr>
+        <w:t>cert_optimize</w:t>
+      </w:r>
+      <w:r>
+        <w:rPr>
+          <w:rFonts w:ascii="Times New Roman" w:hAnsi="Times New Roman" w:eastAsia="宋体"/>
+          <w:b w:val="0"/>
+          <w:i w:val="0"/>
+          <w:sz w:val="24"/>
+        </w:rPr>
+        <w:t xml:space="preserve"> 子框架搜索。</w:t>
       </w:r>
     </w:p>
     <w:p>
@@ -3504,16 +3549,16 @@
           <w:i w:val="0"/>
           <w:sz w:val="24"/>
         </w:rPr>
-        <w:t>P1/P1′</w:t>
-      </w:r>
-      <w:r>
-        <w:rPr>
-          <w:rFonts w:ascii="Times New Roman" w:hAnsi="Times New Roman" w:eastAsia="宋体"/>
-          <w:b w:val="0"/>
-          <w:i w:val="0"/>
-          <w:sz w:val="24"/>
-        </w:rPr>
-        <w:t>（</w:t>
+        <w:t>备注②（初等替代证明）</w:t>
+      </w:r>
+      <w:r>
+        <w:rPr>
+          <w:rFonts w:ascii="Times New Roman" w:hAnsi="Times New Roman" w:eastAsia="宋体"/>
+          <w:b w:val="0"/>
+          <w:i w:val="0"/>
+          <w:sz w:val="24"/>
+        </w:rPr>
+        <w:t>：</w:t>
       </w:r>
       <w:r>
         <w:rPr>
@@ -3522,16 +3567,52 @@
           <w:i w:val="0"/>
           <w:sz w:val="22"/>
         </w:rPr>
-        <w:t>src/P1Coherence.v</w:t>
-      </w:r>
-      <w:r>
-        <w:rPr>
-          <w:rFonts w:ascii="Times New Roman" w:hAnsi="Times New Roman" w:eastAsia="宋体"/>
-          <w:b w:val="0"/>
-          <w:i w:val="0"/>
-          <w:sz w:val="24"/>
-        </w:rPr>
-        <w:t>）：1 ≤ n &lt; n′、d ≤ n′/2 ⟹ coh_T ≥ (2/π)·√(n/n′)；精细版 coh_T ≥ √(n/n′)·(1 − π²d²/(6n′²))（Jordan + sin_bound 交替级数，coqchk 复核通过）——近邻大带相干 ≈ 0.997 的解析根源成为定理。</w:t>
+        <w:t>ten_bands_reject</w:t>
+      </w:r>
+      <w:r>
+        <w:rPr>
+          <w:rFonts w:ascii="Times New Roman" w:hAnsi="Times New Roman" w:eastAsia="宋体"/>
+          <w:b w:val="0"/>
+          <w:i w:val="0"/>
+          <w:sz w:val="24"/>
+        </w:rPr>
+        <w:t>（probe_pigeon，零公理）——</w:t>
+      </w:r>
+      <w:r>
+        <w:rPr>
+          <w:rFonts w:ascii="Times New Roman" w:hAnsi="Times New Roman" w:eastAsia="宋体"/>
+          <w:b/>
+          <w:i w:val="0"/>
+          <w:sz w:val="24"/>
+        </w:rPr>
+        <w:t>任意 10 条 [3,511] 带必含 P2 触发对</w:t>
+      </w:r>
+      <w:r>
+        <w:rPr>
+          <w:rFonts w:ascii="Times New Roman" w:hAnsi="Times New Roman" w:eastAsia="宋体"/>
+          <w:b w:val="0"/>
+          <w:i w:val="0"/>
+          <w:sz w:val="24"/>
+        </w:rPr>
+        <w:t>：插入排序 + 相邻比率 ≥ 9/5 的指数爆炸（Z 层收口）——</w:t>
+      </w:r>
+      <w:r>
+        <w:rPr>
+          <w:rFonts w:ascii="Consolas" w:hAnsi="Consolas" w:eastAsia="等线"/>
+          <w:b w:val="0"/>
+          <w:i w:val="0"/>
+          <w:sz w:val="22"/>
+        </w:rPr>
+        <w:t>pareto_law_main</w:t>
+      </w:r>
+      <w:r>
+        <w:rPr>
+          <w:rFonts w:ascii="Times New Roman" w:hAnsi="Times New Roman" w:eastAsia="宋体"/>
+          <w:b w:val="0"/>
+          <w:i w:val="0"/>
+          <w:sz w:val="24"/>
+        </w:rPr>
+        <w:t xml:space="preserve"> 的初等替代（不需增长假设的链式归纳）；与 T2b 概率版互补（鸽笼 = 确定性、概率版 = whp）。</w:t>
       </w:r>
     </w:p>
     <w:p>
@@ -3545,7 +3626,7 @@
           <w:i w:val="0"/>
           <w:sz w:val="25"/>
         </w:rPr>
-        <w:t>5.6.3 随机版负定律</w:t>
+        <w:t>5.6.2 精确窗口相干下界（与保守界分层）</w:t>
       </w:r>
     </w:p>
     <w:p>
@@ -3559,16 +3640,16 @@
           <w:i w:val="0"/>
           <w:sz w:val="24"/>
         </w:rPr>
-        <w:t>T2a</w:t>
-      </w:r>
-      <w:r>
-        <w:rPr>
-          <w:rFonts w:ascii="Times New Roman" w:hAnsi="Times New Roman" w:eastAsia="宋体"/>
-          <w:b w:val="0"/>
-          <w:i w:val="0"/>
-          <w:sz w:val="24"/>
-        </w:rPr>
-        <w:t xml:space="preserve"> </w:t>
+        <w:t>P1/P1′</w:t>
+      </w:r>
+      <w:r>
+        <w:rPr>
+          <w:rFonts w:ascii="Times New Roman" w:hAnsi="Times New Roman" w:eastAsia="宋体"/>
+          <w:b w:val="0"/>
+          <w:i w:val="0"/>
+          <w:sz w:val="24"/>
+        </w:rPr>
+        <w:t>（</w:t>
       </w:r>
       <w:r>
         <w:rPr>
@@ -3577,34 +3658,30 @@
           <w:i w:val="0"/>
           <w:sz w:val="22"/>
         </w:rPr>
-        <w:t>t2a_same_bin_rejected</w:t>
-      </w:r>
-      <w:r>
-        <w:rPr>
-          <w:rFonts w:ascii="Times New Roman" w:hAnsi="Times New Roman" w:eastAsia="宋体"/>
-          <w:b w:val="0"/>
-          <w:i w:val="0"/>
-          <w:sz w:val="24"/>
-        </w:rPr>
-        <w:t>（</w:t>
-      </w:r>
-      <w:r>
-        <w:rPr>
-          <w:rFonts w:ascii="Consolas" w:hAnsi="Consolas" w:eastAsia="等线"/>
-          <w:b w:val="0"/>
-          <w:i w:val="0"/>
-          <w:sz w:val="22"/>
-        </w:rPr>
-        <w:t>src/ParetoRandom.v</w:t>
-      </w:r>
-      <w:r>
-        <w:rPr>
-          <w:rFonts w:ascii="Times New Roman" w:hAnsi="Times New Roman" w:eastAsia="宋体"/>
-          <w:b w:val="0"/>
-          <w:i w:val="0"/>
-          <w:sz w:val="24"/>
-        </w:rPr>
-        <w:t>）：n &lt; n′ &lt; (9/5)·n ⟹ P2 触发 ⟹ 检查器拒绝（9/5 &lt; c）。</w:t>
+        <w:t>src/P1Coherence.v</w:t>
+      </w:r>
+      <w:r>
+        <w:rPr>
+          <w:rFonts w:ascii="Times New Roman" w:hAnsi="Times New Roman" w:eastAsia="宋体"/>
+          <w:b w:val="0"/>
+          <w:i w:val="0"/>
+          <w:sz w:val="24"/>
+        </w:rPr>
+        <w:t>）：1 ≤ n &lt; n′、d ≤ n′/2 ⟹ coh_T ≥ (2/π)·√(n/n′)；精细版 coh_T ≥ √(n/n′)·(1 − π²d²/(6n′²))（Jordan + sin_bound 交替级数，coqchk 复核通过）——近邻大带相干 ≈ 0.997 的解析根源成为定理。</w:t>
+      </w:r>
+    </w:p>
+    <w:p>
+      <w:pPr>
+        <w:pStyle w:val="Heading3"/>
+      </w:pPr>
+      <w:r>
+        <w:rPr>
+          <w:rFonts w:ascii="Times New Roman" w:hAnsi="Times New Roman" w:eastAsia="黑体"/>
+          <w:b/>
+          <w:i w:val="0"/>
+          <w:sz w:val="25"/>
+        </w:rPr>
+        <w:t>5.6.3 随机版负定律</w:t>
       </w:r>
     </w:p>
     <w:p>
@@ -3618,16 +3695,16 @@
           <w:i w:val="0"/>
           <w:sz w:val="24"/>
         </w:rPr>
-        <w:t>T2b（生日-箱计数）</w:t>
-      </w:r>
-      <w:r>
-        <w:rPr>
-          <w:rFonts w:ascii="Times New Roman" w:hAnsi="Times New Roman" w:eastAsia="宋体"/>
-          <w:b w:val="0"/>
-          <w:i w:val="0"/>
-          <w:sz w:val="24"/>
-        </w:rPr>
-        <w:t>：</w:t>
+        <w:t>T2a</w:t>
+      </w:r>
+      <w:r>
+        <w:rPr>
+          <w:rFonts w:ascii="Times New Roman" w:hAnsi="Times New Roman" w:eastAsia="宋体"/>
+          <w:b w:val="0"/>
+          <w:i w:val="0"/>
+          <w:sz w:val="24"/>
+        </w:rPr>
+        <w:t xml:space="preserve"> </w:t>
       </w:r>
       <w:r>
         <w:rPr>
@@ -3636,16 +3713,16 @@
           <w:i w:val="0"/>
           <w:sz w:val="22"/>
         </w:rPr>
-        <w:t>fall9</w:t>
-      </w:r>
-      <w:r>
-        <w:rPr>
-          <w:rFonts w:ascii="Times New Roman" w:hAnsi="Times New Roman" w:eastAsia="宋体"/>
-          <w:b w:val="0"/>
-          <w:i w:val="0"/>
-          <w:sz w:val="24"/>
-        </w:rPr>
-        <w:t>/</w:t>
+        <w:t>t2a_same_bin_rejected</w:t>
+      </w:r>
+      <w:r>
+        <w:rPr>
+          <w:rFonts w:ascii="Times New Roman" w:hAnsi="Times New Roman" w:eastAsia="宋体"/>
+          <w:b w:val="0"/>
+          <w:i w:val="0"/>
+          <w:sz w:val="24"/>
+        </w:rPr>
+        <w:t>（</w:t>
       </w:r>
       <w:r>
         <w:rPr>
@@ -3654,34 +3731,16 @@
           <w:i w:val="0"/>
           <w:sz w:val="22"/>
         </w:rPr>
-        <w:t>no_collision</w:t>
-      </w:r>
-      <w:r>
-        <w:rPr>
-          <w:rFonts w:ascii="Times New Roman" w:hAnsi="Times New Roman" w:eastAsia="宋体"/>
-          <w:b w:val="0"/>
-          <w:i w:val="0"/>
-          <w:sz w:val="24"/>
-        </w:rPr>
-        <w:t xml:space="preserve"> 定义 + </w:t>
-      </w:r>
-      <w:r>
-        <w:rPr>
-          <w:rFonts w:ascii="Times New Roman" w:hAnsi="Times New Roman" w:eastAsia="宋体"/>
-          <w:b/>
-          <w:i w:val="0"/>
-          <w:sz w:val="24"/>
-        </w:rPr>
-        <w:t>符号化单调性</w:t>
-      </w:r>
-      <w:r>
-        <w:rPr>
-          <w:rFonts w:ascii="Times New Roman" w:hAnsi="Times New Roman" w:eastAsia="宋体"/>
-          <w:b w:val="0"/>
-          <w:i w:val="0"/>
-          <w:sz w:val="24"/>
-        </w:rPr>
-        <w:t>（no_collision (S m) ≤ no_collision m，递推证明不依赖具体数值）+ 数值界：m=7 ⟹ P(同箱对) ≥ 96/100、m=8 ⟹ ≥ 99/100——负定律从"确定性密度上限"延伸到"随机阶梯高概率拒绝"（m≥10 由鸽笼确定性覆盖）。</w:t>
+        <w:t>src/ParetoRandom.v</w:t>
+      </w:r>
+      <w:r>
+        <w:rPr>
+          <w:rFonts w:ascii="Times New Roman" w:hAnsi="Times New Roman" w:eastAsia="宋体"/>
+          <w:b w:val="0"/>
+          <w:i w:val="0"/>
+          <w:sz w:val="24"/>
+        </w:rPr>
+        <w:t>）：n &lt; n′ &lt; (9/5)·n ⟹ P2 触发 ⟹ 检查器拒绝（9/5 &lt; c）。</w:t>
       </w:r>
     </w:p>
     <w:p>
@@ -3691,6 +3750,83 @@
       <w:r>
         <w:rPr>
           <w:rFonts w:ascii="Times New Roman" w:hAnsi="Times New Roman" w:eastAsia="宋体"/>
+          <w:b/>
+          <w:i w:val="0"/>
+          <w:sz w:val="24"/>
+        </w:rPr>
+        <w:t>T2b（生日-箱计数）</w:t>
+      </w:r>
+      <w:r>
+        <w:rPr>
+          <w:rFonts w:ascii="Times New Roman" w:hAnsi="Times New Roman" w:eastAsia="宋体"/>
+          <w:b w:val="0"/>
+          <w:i w:val="0"/>
+          <w:sz w:val="24"/>
+        </w:rPr>
+        <w:t>：</w:t>
+      </w:r>
+      <w:r>
+        <w:rPr>
+          <w:rFonts w:ascii="Consolas" w:hAnsi="Consolas" w:eastAsia="等线"/>
+          <w:b w:val="0"/>
+          <w:i w:val="0"/>
+          <w:sz w:val="22"/>
+        </w:rPr>
+        <w:t>fall9</w:t>
+      </w:r>
+      <w:r>
+        <w:rPr>
+          <w:rFonts w:ascii="Times New Roman" w:hAnsi="Times New Roman" w:eastAsia="宋体"/>
+          <w:b w:val="0"/>
+          <w:i w:val="0"/>
+          <w:sz w:val="24"/>
+        </w:rPr>
+        <w:t>/</w:t>
+      </w:r>
+      <w:r>
+        <w:rPr>
+          <w:rFonts w:ascii="Consolas" w:hAnsi="Consolas" w:eastAsia="等线"/>
+          <w:b w:val="0"/>
+          <w:i w:val="0"/>
+          <w:sz w:val="22"/>
+        </w:rPr>
+        <w:t>no_collision</w:t>
+      </w:r>
+      <w:r>
+        <w:rPr>
+          <w:rFonts w:ascii="Times New Roman" w:hAnsi="Times New Roman" w:eastAsia="宋体"/>
+          <w:b w:val="0"/>
+          <w:i w:val="0"/>
+          <w:sz w:val="24"/>
+        </w:rPr>
+        <w:t xml:space="preserve"> 定义 + </w:t>
+      </w:r>
+      <w:r>
+        <w:rPr>
+          <w:rFonts w:ascii="Times New Roman" w:hAnsi="Times New Roman" w:eastAsia="宋体"/>
+          <w:b/>
+          <w:i w:val="0"/>
+          <w:sz w:val="24"/>
+        </w:rPr>
+        <w:t>符号化单调性</w:t>
+      </w:r>
+      <w:r>
+        <w:rPr>
+          <w:rFonts w:ascii="Times New Roman" w:hAnsi="Times New Roman" w:eastAsia="宋体"/>
+          <w:b w:val="0"/>
+          <w:i w:val="0"/>
+          <w:sz w:val="24"/>
+        </w:rPr>
+        <w:t>（no_collision (S m) ≤ no_collision m，递推证明不依赖具体数值）+ 数值界：m=7 ⟹ P(同箱对) ≥ 96/100、m=8 ⟹ ≥ 99/100——负定律从"确定性密度上限"延伸到"随机阶梯高概率拒绝"（m≥10 由鸽笼确定性覆盖）。</w:t>
+      </w:r>
+    </w:p>
+    <w:p>
+      <w:pPr>
+        <w:pStyle w:val="ListBullet"/>
+      </w:pPr>
+      <w:r>
+        <w:rPr>
+          <w:rFonts w:ascii="Times New Roman" w:hAnsi="Times New Roman" w:eastAsia="宋体"/>
           <w:b w:val="0"/>
           <w:i w:val="0"/>
           <w:sz w:val="24"/>
@@ -3828,34 +3964,16 @@
           <w:i w:val="0"/>
           <w:sz w:val="24"/>
         </w:rPr>
-        <w:t>U5 黄金近碰撞半径</w:t>
-      </w:r>
-      <w:r>
-        <w:rPr>
-          <w:rFonts w:ascii="Times New Roman" w:hAnsi="Times New Roman" w:eastAsia="宋体"/>
-          <w:b w:val="0"/>
-          <w:i w:val="0"/>
-          <w:sz w:val="24"/>
-        </w:rPr>
-        <w:t>（probe_nearcoll，皇冠）：∀ d ≥ 1、∀ m ∈ Z：</w:t>
-      </w:r>
-      <w:r>
-        <w:rPr>
-          <w:rFonts w:ascii="Times New Roman" w:hAnsi="Times New Roman" w:eastAsia="宋体"/>
-          <w:b/>
-          <w:i w:val="0"/>
-          <w:sz w:val="24"/>
-        </w:rPr>
-        <w:t>|d·φ_gold − m| ≥ 1/(3d)</w:t>
-      </w:r>
-      <w:r>
-        <w:rPr>
-          <w:rFonts w:ascii="Times New Roman" w:hAnsi="Times New Roman" w:eastAsia="宋体"/>
-          <w:b w:val="0"/>
-          <w:i w:val="0"/>
-          <w:sz w:val="24"/>
-        </w:rPr>
-        <w:t>（代数数范数路线，</w:t>
+        <w:t>任意角度对 Dirichlet 界与混合网格相干界</w:t>
+      </w:r>
+      <w:r>
+        <w:rPr>
+          <w:rFonts w:ascii="Times New Roman" w:hAnsi="Times New Roman" w:eastAsia="宋体"/>
+          <w:b w:val="0"/>
+          <w:i w:val="0"/>
+          <w:sz w:val="24"/>
+        </w:rPr>
+        <w:t>（probe_pairdirichlet）：任意角度 t1 t2，差频 = 2π·j/N（j mod N ≠ 0）⟹ 任意窗口 W 上 ‖Σ e^{ik·t1}·conj(e^{ik·t2})‖ ≤ N/(2·min(j mod N, N−j mod N))（</w:t>
       </w:r>
       <w:r>
         <w:rPr>
@@ -3864,16 +3982,34 @@
           <w:i w:val="0"/>
           <w:sz w:val="22"/>
         </w:rPr>
-        <w:t>square5_zero</w:t>
-      </w:r>
-      <w:r>
-        <w:rPr>
-          <w:rFonts w:ascii="Times New Roman" w:hAnsi="Times New Roman" w:eastAsia="宋体"/>
-          <w:b w:val="0"/>
-          <w:i w:val="0"/>
-          <w:sz w:val="24"/>
-        </w:rPr>
-        <w:t xml:space="preserve"> 零公理）——近碰撞不能快于 O(1/d) 聚集；与 C5/T2 合成 offset-grid 的完整定量辩护（碰撞谱双向挡死）。</w:t>
+        <w:t>pair_dirichlet</w:t>
+      </w:r>
+      <w:r>
+        <w:rPr>
+          <w:rFonts w:ascii="Times New Roman" w:hAnsi="Times New Roman" w:eastAsia="宋体"/>
+          <w:b w:val="0"/>
+          <w:i w:val="0"/>
+          <w:sz w:val="24"/>
+        </w:rPr>
+        <w:t xml:space="preserve">）；推论 </w:t>
+      </w:r>
+      <w:r>
+        <w:rPr>
+          <w:rFonts w:ascii="Consolas" w:hAnsi="Consolas" w:eastAsia="等线"/>
+          <w:b w:val="0"/>
+          <w:i w:val="0"/>
+          <w:sz w:val="22"/>
+        </w:rPr>
+        <w:t>mixed_grid_coherence</w:t>
+      </w:r>
+      <w:r>
+        <w:rPr>
+          <w:rFonts w:ascii="Times New Roman" w:hAnsi="Times New Roman" w:eastAsia="宋体"/>
+          <w:b w:val="0"/>
+          <w:i w:val="0"/>
+          <w:sz w:val="24"/>
+        </w:rPr>
+        <w:t>：嵌套网格 N 与 a·N 两原子跨网格相干界——grid 崩塌后多尺度设计空间的定理。</w:t>
       </w:r>
     </w:p>
     <w:p>
@@ -3887,6 +4023,65 @@
           <w:i w:val="0"/>
           <w:sz w:val="24"/>
         </w:rPr>
+        <w:t>U5 黄金近碰撞半径</w:t>
+      </w:r>
+      <w:r>
+        <w:rPr>
+          <w:rFonts w:ascii="Times New Roman" w:hAnsi="Times New Roman" w:eastAsia="宋体"/>
+          <w:b w:val="0"/>
+          <w:i w:val="0"/>
+          <w:sz w:val="24"/>
+        </w:rPr>
+        <w:t>（probe_nearcoll，皇冠）：∀ d ≥ 1、∀ m ∈ Z：</w:t>
+      </w:r>
+      <w:r>
+        <w:rPr>
+          <w:rFonts w:ascii="Times New Roman" w:hAnsi="Times New Roman" w:eastAsia="宋体"/>
+          <w:b/>
+          <w:i w:val="0"/>
+          <w:sz w:val="24"/>
+        </w:rPr>
+        <w:t>|d·φ_gold − m| ≥ 1/(3d)</w:t>
+      </w:r>
+      <w:r>
+        <w:rPr>
+          <w:rFonts w:ascii="Times New Roman" w:hAnsi="Times New Roman" w:eastAsia="宋体"/>
+          <w:b w:val="0"/>
+          <w:i w:val="0"/>
+          <w:sz w:val="24"/>
+        </w:rPr>
+        <w:t>（代数数范数路线，</w:t>
+      </w:r>
+      <w:r>
+        <w:rPr>
+          <w:rFonts w:ascii="Consolas" w:hAnsi="Consolas" w:eastAsia="等线"/>
+          <w:b w:val="0"/>
+          <w:i w:val="0"/>
+          <w:sz w:val="22"/>
+        </w:rPr>
+        <w:t>square5_zero</w:t>
+      </w:r>
+      <w:r>
+        <w:rPr>
+          <w:rFonts w:ascii="Times New Roman" w:hAnsi="Times New Roman" w:eastAsia="宋体"/>
+          <w:b w:val="0"/>
+          <w:i w:val="0"/>
+          <w:sz w:val="24"/>
+        </w:rPr>
+        <w:t xml:space="preserve"> 零公理）——近碰撞不能快于 O(1/d) 聚集；与 C5/T2 合成 offset-grid 的完整定量辩护（碰撞谱双向挡死）。</w:t>
+      </w:r>
+    </w:p>
+    <w:p>
+      <w:pPr>
+        <w:pStyle w:val="ListBullet"/>
+      </w:pPr>
+      <w:r>
+        <w:rPr>
+          <w:rFonts w:ascii="Times New Roman" w:hAnsi="Times New Roman" w:eastAsia="宋体"/>
+          <w:b/>
+          <w:i w:val="0"/>
+          <w:sz w:val="24"/>
+        </w:rPr>
         <w:t>τ 三分</w:t>
       </w:r>
       <w:r>
@@ -3897,6 +4092,137 @@
           <w:sz w:val="24"/>
         </w:rPr>
         <w:t>（probe_taudicho，零公理）：碰撞质量 τ 的窗内/OOD/三分刻画。</w:t>
+      </w:r>
+    </w:p>
+    <w:p>
+      <w:pPr>
+        <w:pStyle w:val="ListBullet"/>
+      </w:pPr>
+      <w:r>
+        <w:rPr>
+          <w:rFonts w:ascii="Times New Roman" w:hAnsi="Times New Roman" w:eastAsia="宋体"/>
+          <w:b/>
+          <w:i w:val="0"/>
+          <w:sz w:val="24"/>
+        </w:rPr>
+        <w:t>素数阶梯分辨率与最优性</w:t>
+      </w:r>
+      <w:r>
+        <w:rPr>
+          <w:rFonts w:ascii="Times New Roman" w:hAnsi="Times New Roman" w:eastAsia="宋体"/>
+          <w:b w:val="0"/>
+          <w:i w:val="0"/>
+          <w:sz w:val="24"/>
+        </w:rPr>
+        <w:t>（</w:t>
+      </w:r>
+      <w:r>
+        <w:rPr>
+          <w:rFonts w:ascii="Consolas" w:hAnsi="Consolas" w:eastAsia="等线"/>
+          <w:b w:val="0"/>
+          <w:i w:val="0"/>
+          <w:sz w:val="22"/>
+        </w:rPr>
+        <w:t>src/CRTResolve.v</w:t>
+      </w:r>
+      <w:r>
+        <w:rPr>
+          <w:rFonts w:ascii="Times New Roman" w:hAnsi="Times New Roman" w:eastAsia="宋体"/>
+          <w:b w:val="0"/>
+          <w:i w:val="0"/>
+          <w:sz w:val="24"/>
+        </w:rPr>
+        <w:t xml:space="preserve"> + probe_ladderlimit）：存在性 </w:t>
+      </w:r>
+      <w:r>
+        <w:rPr>
+          <w:rFonts w:ascii="Consolas" w:hAnsi="Consolas" w:eastAsia="等线"/>
+          <w:b w:val="0"/>
+          <w:i w:val="0"/>
+          <w:sz w:val="22"/>
+        </w:rPr>
+        <w:t>prime_ladder_8</w:t>
+      </w:r>
+      <w:r>
+        <w:rPr>
+          <w:rFonts w:ascii="Times New Roman" w:hAnsi="Times New Roman" w:eastAsia="宋体"/>
+          <w:b w:val="0"/>
+          <w:i w:val="0"/>
+          <w:sz w:val="24"/>
+        </w:rPr>
+        <w:t xml:space="preserve"> + </w:t>
+      </w:r>
+      <w:r>
+        <w:rPr>
+          <w:rFonts w:ascii="Consolas" w:hAnsi="Consolas" w:eastAsia="等线"/>
+          <w:b w:val="0"/>
+          <w:i w:val="0"/>
+          <w:sz w:val="22"/>
+        </w:rPr>
+        <w:t>prime_ladder_8_pairwise_coprime</w:t>
+      </w:r>
+      <w:r>
+        <w:rPr>
+          <w:rFonts w:ascii="Times New Roman" w:hAnsi="Times New Roman" w:eastAsia="宋体"/>
+          <w:b w:val="0"/>
+          <w:i w:val="0"/>
+          <w:sz w:val="24"/>
+        </w:rPr>
+        <w:t xml:space="preserve">（8 素数链 [3,7,13,29,59,127,251,503]，两两互素）+ 分辨率 </w:t>
+      </w:r>
+      <w:r>
+        <w:rPr>
+          <w:rFonts w:ascii="Consolas" w:hAnsi="Consolas" w:eastAsia="等线"/>
+          <w:b w:val="0"/>
+          <w:i w:val="0"/>
+          <w:sz w:val="22"/>
+        </w:rPr>
+        <w:t>crt_inj</w:t>
+      </w:r>
+      <w:r>
+        <w:rPr>
+          <w:rFonts w:ascii="Times New Roman" w:hAnsi="Times New Roman" w:eastAsia="宋体"/>
+          <w:b w:val="0"/>
+          <w:i w:val="0"/>
+          <w:sz w:val="24"/>
+        </w:rPr>
+        <w:t xml:space="preserve">（联合模单射，lcm ≈ 7.49×10¹² ≫ 8× 视界）+ </w:t>
+      </w:r>
+      <w:r>
+        <w:rPr>
+          <w:rFonts w:ascii="Times New Roman" w:hAnsi="Times New Roman" w:eastAsia="宋体"/>
+          <w:b/>
+          <w:i w:val="0"/>
+          <w:sz w:val="24"/>
+        </w:rPr>
+        <w:t>最优性 `no_nine_band_ladder`</w:t>
+      </w:r>
+      <w:r>
+        <w:rPr>
+          <w:rFonts w:ascii="Times New Roman" w:hAnsi="Times New Roman" w:eastAsia="宋体"/>
+          <w:b w:val="0"/>
+          <w:i w:val="0"/>
+          <w:sz w:val="24"/>
+        </w:rPr>
+        <w:t>（</w:t>
+      </w:r>
+      <w:r>
+        <w:rPr>
+          <w:rFonts w:ascii="Times New Roman" w:hAnsi="Times New Roman" w:eastAsia="宋体"/>
+          <w:b/>
+          <w:i w:val="0"/>
+          <w:sz w:val="24"/>
+        </w:rPr>
+        <w:t>[3,511] 不存在 9 元素素数阶梯</w:t>
+      </w:r>
+      <w:r>
+        <w:rPr>
+          <w:rFonts w:ascii="Times New Roman" w:hAnsi="Times New Roman" w:eastAsia="宋体"/>
+          <w:b w:val="0"/>
+          <w:i w:val="0"/>
+          <w:sz w:val="24"/>
+        </w:rPr>
+        <w:t>，贪心交换论证，贪心链 113/211/397 更紧）——素数叙事完整（存在性 + 分辨率 + 最优性），支撑论文 B 素数阶梯受控对照（prime-7 vs prime-8）。</w:t>
       </w:r>
     </w:p>
     <w:p>
@@ -4088,6 +4414,47 @@
           <w:sz w:val="24"/>
         </w:rPr>
         <w:t>：K=K' ⟹ 界=0——网格族（任意 a·N 窗口核相同）"注意力核表示级不变性"的证书 0 端点。</w:t>
+      </w:r>
+    </w:p>
+    <w:p>
+      <w:pPr>
+        <w:pStyle w:val="ListBullet"/>
+      </w:pPr>
+      <w:r>
+        <w:rPr>
+          <w:rFonts w:ascii="Times New Roman" w:hAnsi="Times New Roman" w:eastAsia="宋体"/>
+          <w:b/>
+          <w:i w:val="0"/>
+          <w:sz w:val="24"/>
+        </w:rPr>
+        <w:t>ρ^{−3/2} 逐对紧界</w:t>
+      </w:r>
+      <w:r>
+        <w:rPr>
+          <w:rFonts w:ascii="Times New Roman" w:hAnsi="Times New Roman" w:eastAsia="宋体"/>
+          <w:b w:val="0"/>
+          <w:i w:val="0"/>
+          <w:sz w:val="24"/>
+        </w:rPr>
+        <w:t>（probe_pairbound，① 已 Qed）：‖⟨ψ_a,ψ_b⟩‖ ≤ sin(πa/b)·√(ab)/(2(b−a))（</w:t>
+      </w:r>
+      <w:r>
+        <w:rPr>
+          <w:rFonts w:ascii="Consolas" w:hAnsi="Consolas" w:eastAsia="等线"/>
+          <w:b w:val="0"/>
+          <w:i w:val="0"/>
+          <w:sz w:val="22"/>
+        </w:rPr>
+        <w:t>pair_inner_norm</w:t>
+      </w:r>
+      <w:r>
+        <w:rPr>
+          <w:rFonts w:ascii="Times New Roman" w:hAnsi="Times New Roman" w:eastAsia="宋体"/>
+          <w:b w:val="0"/>
+          <w:i w:val="0"/>
+          <w:sz w:val="24"/>
+        </w:rPr>
+        <w:t>，Jordan 分母，逐对 Θ(ρ^{−3/2}) 界，与见证 (2,2C) 之比随 C→∞ → 1）——常数演进线 4K → 2K → Θ(C^{−3/2}) 的逐对引擎已证；行和重组与见证下界进行中（②③，未完成前不入主张）。</w:t>
       </w:r>
     </w:p>
     <w:p>

</xml_diff>

<commit_message>
Papers A: sync rho^-3/2 (ii) rowsum completion — row_sum_3halfs, row_bound_C4 (C=4 row sum <= 2pi/7 < 1, 1D real frame bound), probe count 17, appendix rowsum entry
</commit_message>
<xml_diff>
--- a/papers/论文A中文规范版-CertifiedSparseGating.docx
+++ b/papers/论文A中文规范版-CertifiedSparseGating.docx
@@ -4427,16 +4427,16 @@
           <w:i w:val="0"/>
           <w:sz w:val="24"/>
         </w:rPr>
-        <w:t>ρ^{−3/2} 逐对紧界</w:t>
-      </w:r>
-      <w:r>
-        <w:rPr>
-          <w:rFonts w:ascii="Times New Roman" w:hAnsi="Times New Roman" w:eastAsia="宋体"/>
-          <w:b w:val="0"/>
-          <w:i w:val="0"/>
-          <w:sz w:val="24"/>
-        </w:rPr>
-        <w:t>（probe_pairbound，① 已 Qed）：‖⟨ψ_a,ψ_b⟩‖ ≤ sin(πa/b)·√(ab)/(2(b−a))（</w:t>
+        <w:t>ρ^{−3/2} 紧界</w:t>
+      </w:r>
+      <w:r>
+        <w:rPr>
+          <w:rFonts w:ascii="Times New Roman" w:hAnsi="Times New Roman" w:eastAsia="宋体"/>
+          <w:b w:val="0"/>
+          <w:i w:val="0"/>
+          <w:sz w:val="24"/>
+        </w:rPr>
+        <w:t>（probe_pairbound ① + probe_rowsum ②，①②已 Qed）：逐对界 ‖⟨ψ_a,ψ_b⟩‖ ≤ sin(πa/b)·√(ab)/(2(b−a))（</w:t>
       </w:r>
       <w:r>
         <w:rPr>
@@ -4454,7 +4454,61 @@
           <w:i w:val="0"/>
           <w:sz w:val="24"/>
         </w:rPr>
-        <w:t>，Jordan 分母，逐对 Θ(ρ^{−3/2}) 界，与见证 (2,2C) 之比随 C→∞ → 1）——常数演进线 4K → 2K → Θ(C^{−3/2}) 的逐对引擎已证；行和重组与见证下界进行中（②③，未完成前不入主张）。</w:t>
+        <w:t xml:space="preserve">，Jordan 分母，逐对 Θ(ρ^{−3/2})，与见证 (2,2C) 之比随 C→∞ → 1）；行和重组 </w:t>
+      </w:r>
+      <w:r>
+        <w:rPr>
+          <w:rFonts w:ascii="Times New Roman" w:hAnsi="Times New Roman" w:eastAsia="宋体"/>
+          <w:b/>
+          <w:i w:val="0"/>
+          <w:sz w:val="24"/>
+        </w:rPr>
+        <w:t>`row_sum_3halfs`</w:t>
+      </w:r>
+      <w:r>
+        <w:rPr>
+          <w:rFonts w:ascii="Times New Roman" w:hAnsi="Times New Roman" w:eastAsia="宋体"/>
+          <w:b w:val="0"/>
+          <w:i w:val="0"/>
+          <w:sz w:val="24"/>
+        </w:rPr>
+        <w:t>：C-稀疏梯子任意行 ≤ 2π·C^{−3/2}/(1−C^{−3/2})，</w:t>
+      </w:r>
+      <w:r>
+        <w:rPr>
+          <w:rFonts w:ascii="Times New Roman" w:hAnsi="Times New Roman" w:eastAsia="宋体"/>
+          <w:b/>
+          <w:i w:val="0"/>
+          <w:sz w:val="24"/>
+        </w:rPr>
+        <w:t>`row_bound_C4`：C=4 行和 ≤ 2π/7 ≈ 0.898 &lt; 1——1D C=4 从空洞（2&gt;1，仅存在性）变真实框架界</w:t>
+      </w:r>
+      <w:r>
+        <w:rPr>
+          <w:rFonts w:ascii="Times New Roman" w:hAnsi="Times New Roman" w:eastAsia="宋体"/>
+          <w:b w:val="0"/>
+          <w:i w:val="0"/>
+          <w:sz w:val="24"/>
+        </w:rPr>
+        <w:t>（crude π 界已证；Jordan 紧版 ≈0.53 为紧化目标，未 Qed）。</w:t>
+      </w:r>
+      <w:r>
+        <w:rPr>
+          <w:rFonts w:ascii="Times New Roman" w:hAnsi="Times New Roman" w:eastAsia="宋体"/>
+          <w:b/>
+          <w:i w:val="0"/>
+          <w:sz w:val="24"/>
+        </w:rPr>
+        <w:t>③ 见证下界（(2,2C) 紧性封顶）进行中——未完成前不入主张</w:t>
+      </w:r>
+      <w:r>
+        <w:rPr>
+          <w:rFonts w:ascii="Times New Roman" w:hAnsi="Times New Roman" w:eastAsia="宋体"/>
+          <w:b w:val="0"/>
+          <w:i w:val="0"/>
+          <w:sz w:val="24"/>
+        </w:rPr>
+        <w:t>；窗口/归一化对齐、decay_bound 接口、K0=32 高维联动三风险未清除。</w:t>
       </w:r>
     </w:p>
     <w:p>

</xml_diff>

<commit_message>
Papers + probes: sync rho^-3/2 (iii) witness completion — three-piece suite done
- coq/probes: add probe_rowsum.v + probe_witness.v (18 probes total; both src-side verified: standalone coqc EXIT=0 + coqchk kernel recheck, zero Admitted, hashes 7c415057/d1616a05 match z-zone record)
- Paper A: rho^-3/2 tight-bound three-piece (pairbound + rowsum + witness) all Qed; witness_exact = sin(pi/2C)/sqrt(C), witness_sandwich (1-1/C)*upper <= value <= upper — tightness ratio >= 1-1/C -> 1 (Theta(C^-3/2) cap, machine-checked); 1D C=4 upgraded void -> real frame bound -> tightness cap; probe count 17 -> 18; risk list updated (summation-window alignment cleared; decay_bound interface instantiation pending; K0=32 high-dim coupling not committed)
- Paper B: constant evolution line 4K -> 2K -> Theta(C^-3/2) -> mu=0 (grid endpoint), cross-dimension constant improvement assessed pending decay_bound interface instantiation (patch doc: 论文B更新补丁-ρ3halfs三件套-20260822.md, workspace-only)
</commit_message>
<xml_diff>
--- a/papers/论文A中文规范版-CertifiedSparseGating.docx
+++ b/papers/论文A中文规范版-CertifiedSparseGating.docx
@@ -4427,16 +4427,16 @@
           <w:i w:val="0"/>
           <w:sz w:val="24"/>
         </w:rPr>
-        <w:t>ρ^{−3/2} 紧界</w:t>
-      </w:r>
-      <w:r>
-        <w:rPr>
-          <w:rFonts w:ascii="Times New Roman" w:hAnsi="Times New Roman" w:eastAsia="宋体"/>
-          <w:b w:val="0"/>
-          <w:i w:val="0"/>
-          <w:sz w:val="24"/>
-        </w:rPr>
-        <w:t>（probe_pairbound ① + probe_rowsum ②，①②已 Qed）：逐对界 ‖⟨ψ_a,ψ_b⟩‖ ≤ sin(πa/b)·√(ab)/(2(b−a))（</w:t>
+        <w:t>ρ^{−3/2} 紧界三件套</w:t>
+      </w:r>
+      <w:r>
+        <w:rPr>
+          <w:rFonts w:ascii="Times New Roman" w:hAnsi="Times New Roman" w:eastAsia="宋体"/>
+          <w:b w:val="0"/>
+          <w:i w:val="0"/>
+          <w:sz w:val="24"/>
+        </w:rPr>
+        <w:t>（probe_pairbound ① + probe_rowsum ② + probe_witness ③，2026-08-22 全部 Qed）：逐对界 ‖⟨ψ_a,ψ_b⟩‖ ≤ sin(πa/b)·√(ab)/(2(b−a))（</w:t>
       </w:r>
       <w:r>
         <w:rPr>
@@ -4454,7 +4454,7 @@
           <w:i w:val="0"/>
           <w:sz w:val="24"/>
         </w:rPr>
-        <w:t xml:space="preserve">，Jordan 分母，逐对 Θ(ρ^{−3/2})，与见证 (2,2C) 之比随 C→∞ → 1）；行和重组 </w:t>
+        <w:t xml:space="preserve">，Jordan 分母，逐对 Θ(ρ^{−3/2})）；行和重组 </w:t>
       </w:r>
       <w:r>
         <w:rPr>
@@ -4490,7 +4490,7 @@
           <w:i w:val="0"/>
           <w:sz w:val="24"/>
         </w:rPr>
-        <w:t>（crude π 界已证；Jordan 紧版 ≈0.53 为紧化目标，未 Qed）。</w:t>
+        <w:t>；</w:t>
       </w:r>
       <w:r>
         <w:rPr>
@@ -4499,16 +4499,52 @@
           <w:i w:val="0"/>
           <w:sz w:val="24"/>
         </w:rPr>
-        <w:t>③ 见证下界（(2,2C) 紧性封顶）进行中——未完成前不入主张</w:t>
-      </w:r>
-      <w:r>
-        <w:rPr>
-          <w:rFonts w:ascii="Times New Roman" w:hAnsi="Times New Roman" w:eastAsia="宋体"/>
-          <w:b w:val="0"/>
-          <w:i w:val="0"/>
-          <w:sz w:val="24"/>
-        </w:rPr>
-        <w:t>；窗口/归一化对齐、decay_bound 接口、K0=32 高维联动三风险未清除。</w:t>
+        <w:t>见证封顶（③ probe_witness）</w:t>
+      </w:r>
+      <w:r>
+        <w:rPr>
+          <w:rFonts w:ascii="Times New Roman" w:hAnsi="Times New Roman" w:eastAsia="宋体"/>
+          <w:b w:val="0"/>
+          <w:i w:val="0"/>
+          <w:sz w:val="24"/>
+        </w:rPr>
+        <w:t xml:space="preserve">：见证对 (2,2C) 精确内积 </w:t>
+      </w:r>
+      <w:r>
+        <w:rPr>
+          <w:rFonts w:ascii="Consolas" w:hAnsi="Consolas" w:eastAsia="等线"/>
+          <w:b w:val="0"/>
+          <w:i w:val="0"/>
+          <w:sz w:val="22"/>
+        </w:rPr>
+        <w:t>witness_exact</w:t>
+      </w:r>
+      <w:r>
+        <w:rPr>
+          <w:rFonts w:ascii="Times New Roman" w:hAnsi="Times New Roman" w:eastAsia="宋体"/>
+          <w:b w:val="0"/>
+          <w:i w:val="0"/>
+          <w:sz w:val="24"/>
+        </w:rPr>
+        <w:t xml:space="preserve"> = sin(π/(2C))/√C，且 </w:t>
+      </w:r>
+      <w:r>
+        <w:rPr>
+          <w:rFonts w:ascii="Times New Roman" w:hAnsi="Times New Roman" w:eastAsia="宋体"/>
+          <w:b/>
+          <w:i w:val="0"/>
+          <w:sz w:val="24"/>
+        </w:rPr>
+        <w:t>`witness_sandwich`：(1−1/C)·[上界] ≤ 见证值 ≤ [上界]——上下界之比 ≥ 1−1/C，C→∞ → 1（Θ(C^{−3/2}) 紧性封顶，机器检查）</w:t>
+      </w:r>
+      <w:r>
+        <w:rPr>
+          <w:rFonts w:ascii="Times New Roman" w:hAnsi="Times New Roman" w:eastAsia="宋体"/>
+          <w:b w:val="0"/>
+          <w:i w:val="0"/>
+          <w:sz w:val="24"/>
+        </w:rPr>
+        <w:t>；常数演进线 4K → 2K → Θ(C^{−3/2})（紧）封顶。风险清单更新：求和窗口口径已对齐 Fpair（消除）；decay_bound 新界接口实例化待 src 侧；K0=32 高维联动不承诺。</w:t>
       </w:r>
     </w:p>
     <w:p>

</xml_diff>

<commit_message>
Paper A: align 2D-narrow rename note with draft (reviewer-suggested Degenerate2DFrameCheck/1DParametric2DFrameCheck; code keeps FrameCheck2DNarrow)
</commit_message>
<xml_diff>
--- a/papers/论文A中文规范版-CertifiedSparseGating.docx
+++ b/papers/论文A中文规范版-CertifiedSparseGating.docx
@@ -3036,7 +3036,67 @@
           <w:color w:val="444444"/>
           <w:sz w:val="21"/>
         </w:rPr>
-        <w:t>情形（仅 n₁=1 ∨ n₂=1 的 1D 参数化 2D），非 2D 通用格点检查器；真 2D 格点的运行时反射化为未来工作。</w:t>
+        <w:t xml:space="preserve">情形（仅 n₁=1 ∨ n₂=1 的 1D 参数化 2D），非 2D 通用格点检查器；评审建议更名 </w:t>
+      </w:r>
+      <w:r>
+        <w:rPr>
+          <w:rFonts w:ascii="Consolas" w:hAnsi="Consolas" w:eastAsia="等线"/>
+          <w:b w:val="0"/>
+          <w:i w:val="0"/>
+          <w:color w:val="444444"/>
+          <w:sz w:val="19"/>
+        </w:rPr>
+        <w:t>Degenerate2DFrameCheck</w:t>
+      </w:r>
+      <w:r>
+        <w:rPr>
+          <w:rFonts w:ascii="Times New Roman" w:hAnsi="Times New Roman" w:eastAsia="宋体"/>
+          <w:b w:val="0"/>
+          <w:i/>
+          <w:color w:val="444444"/>
+          <w:sz w:val="21"/>
+        </w:rPr>
+        <w:t>/</w:t>
+      </w:r>
+      <w:r>
+        <w:rPr>
+          <w:rFonts w:ascii="Consolas" w:hAnsi="Consolas" w:eastAsia="等线"/>
+          <w:b w:val="0"/>
+          <w:i w:val="0"/>
+          <w:color w:val="444444"/>
+          <w:sz w:val="19"/>
+        </w:rPr>
+        <w:t>1DParametric2DFrameCheck</w:t>
+      </w:r>
+      <w:r>
+        <w:rPr>
+          <w:rFonts w:ascii="Times New Roman" w:hAnsi="Times New Roman" w:eastAsia="宋体"/>
+          <w:b w:val="0"/>
+          <w:i/>
+          <w:color w:val="444444"/>
+          <w:sz w:val="21"/>
+        </w:rPr>
+        <w:t xml:space="preserve">——本文保留原模块名 </w:t>
+      </w:r>
+      <w:r>
+        <w:rPr>
+          <w:rFonts w:ascii="Consolas" w:hAnsi="Consolas" w:eastAsia="等线"/>
+          <w:b w:val="0"/>
+          <w:i w:val="0"/>
+          <w:color w:val="444444"/>
+          <w:sz w:val="19"/>
+        </w:rPr>
+        <w:t>FrameCheck2DNarrow</w:t>
+      </w:r>
+      <w:r>
+        <w:rPr>
+          <w:rFonts w:ascii="Times New Roman" w:hAnsi="Times New Roman" w:eastAsia="宋体"/>
+          <w:b w:val="0"/>
+          <w:i/>
+          <w:color w:val="444444"/>
+          <w:sz w:val="21"/>
+        </w:rPr>
+        <w:t>（避免跨文档引用失效），全文按"退化单轴"语义引用；真 2D 格点的运行时反射化为未来工作。</w:t>
       </w:r>
     </w:p>
     <w:p>

</xml_diff>

<commit_message>
Papers: integrate offset-grid completion (3 seeds, @4096 16.12+-1.32)
- Paper B: ogrid experiment complete — preregistered 'ogrid >= grid' confirmed (40% better than grid 25.66, 6th positive tau-mechanism judgement); 'certificate free-lunch' falsified (mu=0 exact orthogonality + zero exact collisions still 2.4x worse than rand 6.45, 3.6x vs ALiBi 4.47); dense phase coverage is the key for extrapolation, not orthogonality/collision-freeness; frontier table + FAQ + conclusion updated (5->6 positive judgements)
- Paper A: cross-reference note — offset-grid experiment completed, verdict mutually corroborates P3 (provability(sparse)/extrapolation(dense) two-track separation)
</commit_message>
<xml_diff>
--- a/papers/论文A中文规范版-CertifiedSparseGating.docx
+++ b/papers/论文A中文规范版-CertifiedSparseGating.docx
@@ -4629,6 +4629,60 @@
           <w:sz w:val="24"/>
         </w:rPr>
         <w:t>：本族与 §5.1–5.5 认证链正交，构成"认证（正）— 可证明性边界（负定律）— 碰撞/分辨率刻画（机制）"三角；offset-grid（无理偏移）的证书保持（T1a/Parseval）、零精确碰撞（C5）与近碰撞护城河（U5）三半均机器检查。</w:t>
+      </w:r>
+      <w:r>
+        <w:rPr>
+          <w:rFonts w:ascii="Times New Roman" w:hAnsi="Times New Roman" w:eastAsia="宋体"/>
+          <w:b/>
+          <w:i w:val="0"/>
+          <w:sz w:val="24"/>
+        </w:rPr>
+        <w:t>配套实验已完成（论文 B §8.4，2026-08-22）</w:t>
+      </w:r>
+      <w:r>
+        <w:rPr>
+          <w:rFonts w:ascii="Times New Roman" w:hAnsi="Times New Roman" w:eastAsia="宋体"/>
+          <w:b w:val="0"/>
+          <w:i w:val="0"/>
+          <w:sz w:val="24"/>
+        </w:rPr>
+        <w:t xml:space="preserve">：offset-grid @4096 16.12±1.32——ogrid ≥ grid 确认（碰撞机制第 6 个正向判决）+ </w:t>
+      </w:r>
+      <w:r>
+        <w:rPr>
+          <w:rFonts w:ascii="Times New Roman" w:hAnsi="Times New Roman" w:eastAsia="宋体"/>
+          <w:b/>
+          <w:i w:val="0"/>
+          <w:sz w:val="24"/>
+        </w:rPr>
+        <w:t>证书免费性被证伪</w:t>
+      </w:r>
+      <w:r>
+        <w:rPr>
+          <w:rFonts w:ascii="Times New Roman" w:hAnsi="Times New Roman" w:eastAsia="宋体"/>
+          <w:b w:val="0"/>
+          <w:i w:val="0"/>
+          <w:sz w:val="24"/>
+        </w:rPr>
+        <w:t>（μ=0 精确正交 ∧ 零精确碰撞仍差 rand 2.4×）——与 P3 定理互证：</w:t>
+      </w:r>
+      <w:r>
+        <w:rPr>
+          <w:rFonts w:ascii="Times New Roman" w:hAnsi="Times New Roman" w:eastAsia="宋体"/>
+          <w:b/>
+          <w:i w:val="0"/>
+          <w:sz w:val="24"/>
+        </w:rPr>
+        <w:t>可证性（稀疏）与外推性（稠密）在实证与定理双轨分离</w:t>
+      </w:r>
+      <w:r>
+        <w:rPr>
+          <w:rFonts w:ascii="Times New Roman" w:hAnsi="Times New Roman" w:eastAsia="宋体"/>
+          <w:b w:val="0"/>
+          <w:i w:val="0"/>
+          <w:sz w:val="24"/>
+        </w:rPr>
+        <w:t>。</w:t>
       </w:r>
     </w:p>
     <w:p>

</xml_diff>

<commit_message>
papers A v2.19: section-6 two-layer extraction boundary clarification (review CR-efficiency query) - runtime checking carried entirely by Z/Q reflection layer (binary arithmetic, no approximation loops, <1ms benchmarked); constructive-reals layer not on runtime path (CRcarrier abstract / Cauchy instance compile-only, CR_of_Q constant embedding); DkMLNative compile-pass = well-formedness not runtime performance claim
</commit_message>
<xml_diff>
--- a/papers/论文A中文规范版-CertifiedSparseGating.docx
+++ b/papers/论文A中文规范版-CertifiedSparseGating.docx
@@ -59,7 +59,7 @@
           <w:color w:val="444444"/>
           <w:sz w:val="21"/>
         </w:rPr>
-        <w:t>版本：最终版 v2.18（2026-08-31）｜代码基态：PSA_framework.v（18 模块 / 269 顶层 Lemma·Theorem（316 顶层声明 / 272 Qed 口径内）/ 165 项审计：</w:t>
+        <w:t>版本：最终版 v2.19（2026-08-31）｜代码基态：PSA_framework.v（18 模块 / 269 顶层 Lemma·Theorem（316 顶层声明 / 272 Qed 口径内）/ 165 项审计：</w:t>
       </w:r>
       <w:r>
         <w:rPr>
@@ -200,6 +200,121 @@
           <w:sz w:val="21"/>
         </w:rPr>
         <w:t>：lib 链编译 + 合并版编译（Rocq 9.0 + mathcomp 2.6 真环境）+ PSA 核心三文件 + 零 Admitted 检查 + coqchk 内核独立复验，五步全过</w:t>
+      </w:r>
+    </w:p>
+    <w:p>
+      <w:pPr>
+        <w:ind w:left="432"/>
+      </w:pPr>
+      <w:r>
+        <w:rPr>
+          <w:rFonts w:ascii="Times New Roman" w:hAnsi="Times New Roman" w:eastAsia="宋体"/>
+          <w:b w:val="0"/>
+          <w:i/>
+          <w:color w:val="444444"/>
+          <w:sz w:val="21"/>
+        </w:rPr>
+        <w:t>修订摘要（v2.18→v2.19，2026-08-31，评审 CR 效率质询澄清）：</w:t>
+      </w:r>
+      <w:r>
+        <w:rPr>
+          <w:rFonts w:ascii="Times New Roman" w:hAnsi="Times New Roman" w:eastAsia="宋体"/>
+          <w:b/>
+          <w:i/>
+          <w:color w:val="444444"/>
+          <w:sz w:val="21"/>
+        </w:rPr>
+        <w:t>§6 新增「两层提取的边界」声明</w:t>
+      </w:r>
+      <w:r>
+        <w:rPr>
+          <w:rFonts w:ascii="Times New Roman" w:hAnsi="Times New Roman" w:eastAsia="宋体"/>
+          <w:b w:val="0"/>
+          <w:i/>
+          <w:color w:val="444444"/>
+          <w:sz w:val="21"/>
+        </w:rPr>
+        <w:t>——运行时检查全部由 Z/Q 反射层承载（四级判定/安全域/窗口判定/</w:t>
+      </w:r>
+      <w:r>
+        <w:rPr>
+          <w:rFonts w:ascii="Consolas" w:hAnsi="Consolas" w:eastAsia="等线"/>
+          <w:b w:val="0"/>
+          <w:i w:val="0"/>
+          <w:color w:val="444444"/>
+          <w:sz w:val="19"/>
+        </w:rPr>
+        <w:t>psa_guard</w:t>
+      </w:r>
+      <w:r>
+        <w:rPr>
+          <w:rFonts w:ascii="Times New Roman" w:hAnsi="Times New Roman" w:eastAsia="宋体"/>
+          <w:b w:val="0"/>
+          <w:i/>
+          <w:color w:val="444444"/>
+          <w:sz w:val="21"/>
+        </w:rPr>
+        <w:t xml:space="preserve"> 原生镜像：nat/Z/Q 层函数、Pos/Z 二进制算术、无逼近循环，&lt;1 ms 实测已随稿）；构造性实数层（ConstructiveReals）不进入任何运行时路径（</w:t>
+      </w:r>
+      <w:r>
+        <w:rPr>
+          <w:rFonts w:ascii="Consolas" w:hAnsi="Consolas" w:eastAsia="等线"/>
+          <w:b w:val="0"/>
+          <w:i w:val="0"/>
+          <w:color w:val="444444"/>
+          <w:sz w:val="19"/>
+        </w:rPr>
+        <w:t>CRcarrier</w:t>
+      </w:r>
+      <w:r>
+        <w:rPr>
+          <w:rFonts w:ascii="Times New Roman" w:hAnsi="Times New Roman" w:eastAsia="宋体"/>
+          <w:b w:val="0"/>
+          <w:i/>
+          <w:color w:val="444444"/>
+          <w:sz w:val="21"/>
+        </w:rPr>
+        <w:t xml:space="preserve"> 抽象类型参数 / </w:t>
+      </w:r>
+      <w:r>
+        <w:rPr>
+          <w:rFonts w:ascii="Consolas" w:hAnsi="Consolas" w:eastAsia="等线"/>
+          <w:b w:val="0"/>
+          <w:i w:val="0"/>
+          <w:color w:val="444444"/>
+          <w:sz w:val="19"/>
+        </w:rPr>
+        <w:t>taugrid_cr</w:t>
+      </w:r>
+      <w:r>
+        <w:rPr>
+          <w:rFonts w:ascii="Times New Roman" w:hAnsi="Times New Roman" w:eastAsia="宋体"/>
+          <w:b w:val="0"/>
+          <w:i/>
+          <w:color w:val="444444"/>
+          <w:sz w:val="21"/>
+        </w:rPr>
+        <w:t xml:space="preserve"> 柯西实例仅编译验证；</w:t>
+      </w:r>
+      <w:r>
+        <w:rPr>
+          <w:rFonts w:ascii="Consolas" w:hAnsi="Consolas" w:eastAsia="等线"/>
+          <w:b w:val="0"/>
+          <w:i w:val="0"/>
+          <w:color w:val="444444"/>
+          <w:sz w:val="19"/>
+        </w:rPr>
+        <w:t>CR_of_Q</w:t>
+      </w:r>
+      <w:r>
+        <w:rPr>
+          <w:rFonts w:ascii="Times New Roman" w:hAnsi="Times New Roman" w:eastAsia="宋体"/>
+          <w:b w:val="0"/>
+          <w:i/>
+          <w:color w:val="444444"/>
+          <w:sz w:val="21"/>
+        </w:rPr>
+        <w:t xml:space="preserve"> 为有理常数嵌入件，其二分表示不承载运行时判定）；「经 DkMLNative 编译通过」= 良构性与可执行结构验证，非运行时性能主张——构造性轨道角色 = 公理独立性与可计算性验证，生产检查器由经典/反射轨道承担（与 v2.13 轨道定位声明一致）。纯文本澄清，无代码与定理改动；草稿无 §6 基准节，不同步。</w:t>
       </w:r>
     </w:p>
     <w:p>
@@ -16811,6 +16926,119 @@
           <w:sz w:val="24"/>
         </w:rPr>
         <w:t xml:space="preserve"> 随稿）。</w:t>
+      </w:r>
+    </w:p>
+    <w:p>
+      <w:pPr>
+        <w:pStyle w:val="ListBullet"/>
+      </w:pPr>
+      <w:r>
+        <w:rPr>
+          <w:rFonts w:ascii="Times New Roman" w:hAnsi="Times New Roman" w:eastAsia="宋体"/>
+          <w:b/>
+          <w:i w:val="0"/>
+          <w:sz w:val="24"/>
+        </w:rPr>
+        <w:t>两层提取的边界（CR 效率质询澄清）</w:t>
+      </w:r>
+      <w:r>
+        <w:rPr>
+          <w:rFonts w:ascii="Times New Roman" w:hAnsi="Times New Roman" w:eastAsia="宋体"/>
+          <w:b w:val="0"/>
+          <w:i w:val="0"/>
+          <w:sz w:val="24"/>
+        </w:rPr>
+        <w:t xml:space="preserve">：运行时检查全部由 Z/Q 反射层承载——上项基准中的四级判定、安全域、窗口判定与 </w:t>
+      </w:r>
+      <w:r>
+        <w:rPr>
+          <w:rFonts w:ascii="Consolas" w:hAnsi="Consolas" w:eastAsia="等线"/>
+          <w:b w:val="0"/>
+          <w:i w:val="0"/>
+          <w:sz w:val="22"/>
+        </w:rPr>
+        <w:t>psa_guard</w:t>
+      </w:r>
+      <w:r>
+        <w:rPr>
+          <w:rFonts w:ascii="Times New Roman" w:hAnsi="Times New Roman" w:eastAsia="宋体"/>
+          <w:b w:val="0"/>
+          <w:i w:val="0"/>
+          <w:sz w:val="24"/>
+        </w:rPr>
+        <w:t xml:space="preserve"> 原生镜像均为 nat/Z/Q 层函数（Pos/Z 二进制算术，无逼近循环）；构造性实数层（ConstructiveReals）不进入任何运行时路径——其提取物中 </w:t>
+      </w:r>
+      <w:r>
+        <w:rPr>
+          <w:rFonts w:ascii="Consolas" w:hAnsi="Consolas" w:eastAsia="等线"/>
+          <w:b w:val="0"/>
+          <w:i w:val="0"/>
+          <w:sz w:val="22"/>
+        </w:rPr>
+        <w:t>CRcarrier</w:t>
+      </w:r>
+      <w:r>
+        <w:rPr>
+          <w:rFonts w:ascii="Times New Roman" w:hAnsi="Times New Roman" w:eastAsia="宋体"/>
+          <w:b w:val="0"/>
+          <w:i w:val="0"/>
+          <w:sz w:val="24"/>
+        </w:rPr>
+        <w:t xml:space="preserve"> 保持抽象类型参数（</w:t>
+      </w:r>
+      <w:r>
+        <w:rPr>
+          <w:rFonts w:ascii="Consolas" w:hAnsi="Consolas" w:eastAsia="等线"/>
+          <w:b w:val="0"/>
+          <w:i w:val="0"/>
+          <w:sz w:val="22"/>
+        </w:rPr>
+        <w:t>g7_welch_cr</w:t>
+      </w:r>
+      <w:r>
+        <w:rPr>
+          <w:rFonts w:ascii="Times New Roman" w:hAnsi="Times New Roman" w:eastAsia="宋体"/>
+          <w:b w:val="0"/>
+          <w:i w:val="0"/>
+          <w:sz w:val="24"/>
+        </w:rPr>
+        <w:t xml:space="preserve"> 等），或仅作柯西实例化的编译验证（</w:t>
+      </w:r>
+      <w:r>
+        <w:rPr>
+          <w:rFonts w:ascii="Consolas" w:hAnsi="Consolas" w:eastAsia="等线"/>
+          <w:b w:val="0"/>
+          <w:i w:val="0"/>
+          <w:sz w:val="22"/>
+        </w:rPr>
+        <w:t>taugrid_cr.ml</w:t>
+      </w:r>
+      <w:r>
+        <w:rPr>
+          <w:rFonts w:ascii="Times New Roman" w:hAnsi="Times New Roman" w:eastAsia="宋体"/>
+          <w:b w:val="0"/>
+          <w:i w:val="0"/>
+          <w:sz w:val="24"/>
+        </w:rPr>
+        <w:t>）；</w:t>
+      </w:r>
+      <w:r>
+        <w:rPr>
+          <w:rFonts w:ascii="Consolas" w:hAnsi="Consolas" w:eastAsia="等线"/>
+          <w:b w:val="0"/>
+          <w:i w:val="0"/>
+          <w:sz w:val="22"/>
+        </w:rPr>
+        <w:t>CR_of_Q</w:t>
+      </w:r>
+      <w:r>
+        <w:rPr>
+          <w:rFonts w:ascii="Times New Roman" w:hAnsi="Times New Roman" w:eastAsia="宋体"/>
+          <w:b w:val="0"/>
+          <w:i w:val="0"/>
+          <w:sz w:val="24"/>
+        </w:rPr>
+        <w:t xml:space="preserve"> 在该层仅用于把有理常数嵌入实数 carrier 以调用库引理，其二分表示不承载任何运行时判定。如实定位：构造性轨道提取物「经 DkMLNative 编译通过」是良构性与可执行结构验证，非运行时性能主张——该轨道的角色是公理独立性与可计算性验证，生产检查器由经典/反射轨道承担。</w:t>
       </w:r>
     </w:p>
     <w:p>

</xml_diff>

<commit_message>
papers A v2.20 + artifact hygiene: 4-atom extension clarified as NOT in artifact (zero Admitted, CI grep + coqchk + 165 audits; sole statement-form Abort is vendored deps/mathcomp; pairwise window closed mu*4=45156/33920>1 c4_mu4_window; Gram route outcome undecided - future work item 1) + PSA_audit.v stale TODO comment removed (frame_check_instance_sound is Qed since 3780 banner, recompiled EXIT=0 54x Closed)
</commit_message>
<xml_diff>
--- a/papers/论文A中文规范版-CertifiedSparseGating.docx
+++ b/papers/论文A中文规范版-CertifiedSparseGating.docx
@@ -59,7 +59,7 @@
           <w:color w:val="444444"/>
           <w:sz w:val="21"/>
         </w:rPr>
-        <w:t>版本：最终版 v2.19（2026-08-31）｜代码基态：PSA_framework.v（18 模块 / 269 顶层 Lemma·Theorem（316 顶层声明 / 272 Qed 口径内）/ 165 项审计：</w:t>
+        <w:t>版本：最终版 v2.20（2026-08-31）｜代码基态：PSA_framework.v（18 模块 / 269 顶层 Lemma·Theorem（316 顶层声明 / 272 Qed 口径内）/ 165 项审计：</w:t>
       </w:r>
       <w:r>
         <w:rPr>
@@ -200,6 +200,121 @@
           <w:sz w:val="21"/>
         </w:rPr>
         <w:t>：lib 链编译 + 合并版编译（Rocq 9.0 + mathcomp 2.6 真环境）+ PSA 核心三文件 + 零 Admitted 检查 + coqchk 内核独立复验，五步全过</w:t>
+      </w:r>
+    </w:p>
+    <w:p>
+      <w:pPr>
+        <w:ind w:left="432"/>
+      </w:pPr>
+      <w:r>
+        <w:rPr>
+          <w:rFonts w:ascii="Times New Roman" w:hAnsi="Times New Roman" w:eastAsia="宋体"/>
+          <w:b w:val="0"/>
+          <w:i/>
+          <w:color w:val="444444"/>
+          <w:sz w:val="21"/>
+        </w:rPr>
+        <w:t>修订摘要（v2.19→v2.20，2026-08-31，评审「4 原子扩展 = Admitted/TODO？」质询澄清 + Artifact 残余清理）：</w:t>
+      </w:r>
+      <w:r>
+        <w:rPr>
+          <w:rFonts w:ascii="Times New Roman" w:hAnsi="Times New Roman" w:eastAsia="宋体"/>
+          <w:b/>
+          <w:i/>
+          <w:color w:val="444444"/>
+          <w:sz w:val="21"/>
+        </w:rPr>
+        <w:t>§5.6.6 意义段措辞锐化</w:t>
+      </w:r>
+      <w:r>
+        <w:rPr>
+          <w:rFonts w:ascii="Times New Roman" w:hAnsi="Times New Roman" w:eastAsia="宋体"/>
+          <w:b w:val="0"/>
+          <w:i/>
+          <w:color w:val="444444"/>
+          <w:sz w:val="21"/>
+        </w:rPr>
+        <w:t>——「直截但未完成的计算」改为无歧义表述：全窗口 4 原子稀疏唯一性扩展</w:t>
+      </w:r>
+      <w:r>
+        <w:rPr>
+          <w:rFonts w:ascii="Times New Roman" w:hAnsi="Times New Roman" w:eastAsia="宋体"/>
+          <w:b/>
+          <w:i/>
+          <w:color w:val="444444"/>
+          <w:sz w:val="21"/>
+        </w:rPr>
+        <w:t>不在 Artifact 中</w:t>
+      </w:r>
+      <w:r>
+        <w:rPr>
+          <w:rFonts w:ascii="Times New Roman" w:hAnsi="Times New Roman" w:eastAsia="宋体"/>
+          <w:b w:val="0"/>
+          <w:i/>
+          <w:color w:val="444444"/>
+          <w:sz w:val="21"/>
+        </w:rPr>
+        <w:t>（全库零 Admitted、零挂起证明义务——CI 语句形 grep + coqchk + 165 项审计三重背书；仓库唯一语句形 Abort 在 vendored 第三方 deps/mathcomp）；两两相干判据已关窗（μ·4 = 45156/33920 &gt; 1，</w:t>
+      </w:r>
+      <w:r>
+        <w:rPr>
+          <w:rFonts w:ascii="Consolas" w:hAnsi="Consolas" w:eastAsia="等线"/>
+          <w:b w:val="0"/>
+          <w:i w:val="0"/>
+          <w:color w:val="444444"/>
+          <w:sz w:val="19"/>
+        </w:rPr>
+        <w:t>c4_mu4_window</w:t>
+      </w:r>
+      <w:r>
+        <w:rPr>
+          <w:rFonts w:ascii="Times New Roman" w:hAnsi="Times New Roman" w:eastAsia="宋体"/>
+          <w:b w:val="0"/>
+          <w:i/>
+          <w:color w:val="444444"/>
+          <w:sz w:val="21"/>
+        </w:rPr>
+        <w:t xml:space="preserve"> 机器判定），扩展须走 Gram 特征值口径数值裁决且结果未定——「直截」仅指判定动作；扩展显式列入 future work 第一项。</w:t>
+      </w:r>
+      <w:r>
+        <w:rPr>
+          <w:rFonts w:ascii="Times New Roman" w:hAnsi="Times New Roman" w:eastAsia="宋体"/>
+          <w:b/>
+          <w:i/>
+          <w:color w:val="444444"/>
+          <w:sz w:val="21"/>
+        </w:rPr>
+        <w:t>代码侧</w:t>
+      </w:r>
+      <w:r>
+        <w:rPr>
+          <w:rFonts w:ascii="Times New Roman" w:hAnsi="Times New Roman" w:eastAsia="宋体"/>
+          <w:b w:val="0"/>
+          <w:i/>
+          <w:color w:val="444444"/>
+          <w:sz w:val="21"/>
+        </w:rPr>
+        <w:t>：</w:t>
+      </w:r>
+      <w:r>
+        <w:rPr>
+          <w:rFonts w:ascii="Consolas" w:hAnsi="Consolas" w:eastAsia="等线"/>
+          <w:b w:val="0"/>
+          <w:i w:val="0"/>
+          <w:color w:val="444444"/>
+          <w:sz w:val="19"/>
+        </w:rPr>
+        <w:t>PSA_audit.v</w:t>
+      </w:r>
+      <w:r>
+        <w:rPr>
+          <w:rFonts w:ascii="Times New Roman" w:hAnsi="Times New Roman" w:eastAsia="宋体"/>
+          <w:b w:val="0"/>
+          <w:i/>
+          <w:color w:val="444444"/>
+          <w:sz w:val="21"/>
+        </w:rPr>
+        <w:t xml:space="preserve"> L179 陈旧注释清理（「未证毕部分见 frame_check_instance_sound TODO」→ 该定理已 Qed，改指装配段 banner）——全库唯一 TODO 形态残余归零；重编译 EXIT=0（54×Closed）。纯注释+文本，无定理改动。</w:t>
       </w:r>
     </w:p>
     <w:p>
@@ -16269,7 +16384,7 @@
           <w:i w:val="0"/>
           <w:sz w:val="24"/>
         </w:rPr>
-        <w:t>；第 4 原子 213 未覆盖）；全窗口 [3,13,53,213] 四原子的稀疏唯一性扩展是</w:t>
+        <w:t>；第 4 原子 213 未覆盖）；全窗口 [3,13,53,213] 四原子的稀疏唯一性扩展</w:t>
       </w:r>
       <w:r>
         <w:rPr>
@@ -16278,16 +16393,16 @@
           <w:i w:val="0"/>
           <w:sz w:val="24"/>
         </w:rPr>
-        <w:t>直截但未完成的计算</w:t>
-      </w:r>
-      <w:r>
-        <w:rPr>
-          <w:rFonts w:ascii="Times New Roman" w:hAnsi="Times New Roman" w:eastAsia="宋体"/>
-          <w:b w:val="0"/>
-          <w:i w:val="0"/>
-          <w:sz w:val="24"/>
-        </w:rPr>
-        <w:t xml:space="preserve">（必要的逐对相干界已在 </w:t>
+        <w:t>不在本 Artifact 中</w:t>
+      </w:r>
+      <w:r>
+        <w:rPr>
+          <w:rFonts w:ascii="Times New Roman" w:hAnsi="Times New Roman" w:eastAsia="宋体"/>
+          <w:b w:val="0"/>
+          <w:i w:val="0"/>
+          <w:sz w:val="24"/>
+        </w:rPr>
+        <w:t xml:space="preserve">——全库零 </w:t>
       </w:r>
       <w:r>
         <w:rPr>
@@ -16296,16 +16411,34 @@
           <w:i w:val="0"/>
           <w:sz w:val="22"/>
         </w:rPr>
-        <w:t>PSA_framework.v</w:t>
-      </w:r>
-      <w:r>
-        <w:rPr>
-          <w:rFonts w:ascii="Times New Roman" w:hAnsi="Times New Roman" w:eastAsia="宋体"/>
-          <w:b w:val="0"/>
-          <w:i w:val="0"/>
-          <w:sz w:val="24"/>
-        </w:rPr>
-        <w:t>，四原子需组装 6 对并验证 μ·4 &lt; 1）；更大阶实例（如 C=9 的 s≤4）及与 ρ^{−3/2} 行和紧界（§5.6.5，C=4 行和 2π/7 &lt; 1）的合成仍为后续工作（future work 第一项）。</w:t>
+        <w:t>Admitted</w:t>
+      </w:r>
+      <w:r>
+        <w:rPr>
+          <w:rFonts w:ascii="Times New Roman" w:hAnsi="Times New Roman" w:eastAsia="宋体"/>
+          <w:b w:val="0"/>
+          <w:i w:val="0"/>
+          <w:sz w:val="24"/>
+        </w:rPr>
+        <w:t>、零挂起证明义务（CI 语句形 grep + coqchk 内核复验 + 165 项 Print Assumptions 审计三重背书）；四原子需组装 6 对逐对界，但两两相干判据已关窗（μ·4 = 45156/33920 &gt; 1，</w:t>
+      </w:r>
+      <w:r>
+        <w:rPr>
+          <w:rFonts w:ascii="Consolas" w:hAnsi="Consolas" w:eastAsia="等线"/>
+          <w:b w:val="0"/>
+          <w:i w:val="0"/>
+          <w:sz w:val="22"/>
+        </w:rPr>
+        <w:t>c4_mu4_window</w:t>
+      </w:r>
+      <w:r>
+        <w:rPr>
+          <w:rFonts w:ascii="Times New Roman" w:hAnsi="Times New Roman" w:eastAsia="宋体"/>
+          <w:b w:val="0"/>
+          <w:i w:val="0"/>
+          <w:sz w:val="24"/>
+        </w:rPr>
+        <w:t xml:space="preserve"> 机器判定），扩展须改走精确 Gram 特征值口径（G-1 闭式）的数值裁决，其结果（λ_min 是否 &gt; 0）未定——「直截」仅指判定动作本身，不预支结论。该扩展与更大阶实例（如 C=9 的 s≤4）及与 ρ^{−3/2} 行和紧界（§5.6.5，C=4 行和 2π/7 &lt; 1）的合成显式列为后续工作（future work 第一项）。</w:t>
       </w:r>
       <w:r>
         <w:rPr>

</xml_diff>

<commit_message>
papers A v2.22: archaeology round-4 alignment (A1-A6) + CS-20 sunk-asset entry - section-9 G-3 honestly downgraded to one-way implication (D7 residue cleared, G-11 cited as true iff); baseline counts unified to ca_merged_full_25_m2.v 92743 lines/69 partitions (run20 EXIT=0); appendix A +5 rows (G-7/G-9/G-10/G-11/CS-20); abstract +G-9 closed form and +G-11 iff; section-6 deployment-family benchmark boundary; CS-20 positive random side entered (pairwise_inner_bound_probabilistic, ca_sparse_ext, whp pairwise under superlinear growth)
</commit_message>
<xml_diff>
--- a/papers/论文A中文规范版-CertifiedSparseGating.docx
+++ b/papers/论文A中文规范版-CertifiedSparseGating.docx
@@ -59,7 +59,7 @@
           <w:color w:val="444444"/>
           <w:sz w:val="21"/>
         </w:rPr>
-        <w:t>版本：最终版 v2.21（2026-08-31）｜代码基态：PSA_framework.v（18 模块 / 269 顶层 Lemma·Theorem（316 顶层声明 / 272 Qed 口径内）/ 165 项审计：</w:t>
+        <w:t>版本：最终版 v2.22（2026-08-31）｜代码基态：PSA_framework.v（18 模块 / 269 顶层 Lemma·Theorem（316 顶层声明 / 272 Qed 口径内）/ 165 项审计：</w:t>
       </w:r>
       <w:r>
         <w:rPr>
@@ -200,6 +200,161 @@
           <w:sz w:val="21"/>
         </w:rPr>
         <w:t>：lib 链编译 + 合并版编译（Rocq 9.0 + mathcomp 2.6 真环境）+ PSA 核心三文件 + 零 Admitted 检查 + coqchk 内核独立复验，五步全过</w:t>
+      </w:r>
+    </w:p>
+    <w:p>
+      <w:pPr>
+        <w:ind w:left="432"/>
+      </w:pPr>
+      <w:r>
+        <w:rPr>
+          <w:rFonts w:ascii="Times New Roman" w:hAnsi="Times New Roman" w:eastAsia="宋体"/>
+          <w:b w:val="0"/>
+          <w:i/>
+          <w:color w:val="444444"/>
+          <w:sz w:val="21"/>
+        </w:rPr>
+        <w:t>修订摘要（v2.21→v2.22，2026-08-31，考古四轮 A1–A6 对齐 + CS-20 沉没资产入文）：</w:t>
+      </w:r>
+      <w:r>
+        <w:rPr>
+          <w:rFonts w:ascii="Times New Roman" w:hAnsi="Times New Roman" w:eastAsia="宋体"/>
+          <w:b/>
+          <w:i/>
+          <w:color w:val="444444"/>
+          <w:sz w:val="21"/>
+        </w:rPr>
+        <w:t>§9 G-3 条目名实修正</w:t>
+      </w:r>
+      <w:r>
+        <w:rPr>
+          <w:rFonts w:ascii="Times New Roman" w:hAnsi="Times New Roman" w:eastAsia="宋体"/>
+          <w:b w:val="0"/>
+          <w:i/>
+          <w:color w:val="444444"/>
+          <w:sz w:val="21"/>
+        </w:rPr>
+        <w:t>（与 §5 同口径：g3_certifiable_iff 如实降格单向蕴含、G-11 引为真 iff——D7 正文残留清除）；</w:t>
+      </w:r>
+      <w:r>
+        <w:rPr>
+          <w:rFonts w:ascii="Times New Roman" w:hAnsi="Times New Roman" w:eastAsia="宋体"/>
+          <w:b/>
+          <w:i/>
+          <w:color w:val="444444"/>
+          <w:sz w:val="21"/>
+        </w:rPr>
+        <w:t>基态口径统一</w:t>
+      </w:r>
+      <w:r>
+        <w:rPr>
+          <w:rFonts w:ascii="Times New Roman" w:hAnsi="Times New Roman" w:eastAsia="宋体"/>
+          <w:b w:val="0"/>
+          <w:i/>
+          <w:color w:val="444444"/>
+          <w:sz w:val="21"/>
+        </w:rPr>
+        <w:t>（§2/§12/附录 A 切换 ca_merged_full_25_m2.v 92743 行/69 分区、本地 2.5 全量 EXIT=0 run20 口径）；</w:t>
+      </w:r>
+      <w:r>
+        <w:rPr>
+          <w:rFonts w:ascii="Times New Roman" w:hAnsi="Times New Roman" w:eastAsia="宋体"/>
+          <w:b/>
+          <w:i/>
+          <w:color w:val="444444"/>
+          <w:sz w:val="21"/>
+        </w:rPr>
+        <w:t>附录 A 补 G-7/G-9/G-10/G-11/CS-20 五行</w:t>
+      </w:r>
+      <w:r>
+        <w:rPr>
+          <w:rFonts w:ascii="Times New Roman" w:hAnsi="Times New Roman" w:eastAsia="宋体"/>
+          <w:b w:val="0"/>
+          <w:i/>
+          <w:color w:val="444444"/>
+          <w:sz w:val="21"/>
+        </w:rPr>
+        <w:t xml:space="preserve"> + 合并版行刷新；</w:t>
+      </w:r>
+      <w:r>
+        <w:rPr>
+          <w:rFonts w:ascii="Times New Roman" w:hAnsi="Times New Roman" w:eastAsia="宋体"/>
+          <w:b/>
+          <w:i/>
+          <w:color w:val="444444"/>
+          <w:sz w:val="21"/>
+        </w:rPr>
+        <w:t>Abstract 补 G-9 闭合式与 G-11 真 iff 各半句</w:t>
+      </w:r>
+      <w:r>
+        <w:rPr>
+          <w:rFonts w:ascii="Times New Roman" w:hAnsi="Times New Roman" w:eastAsia="宋体"/>
+          <w:b w:val="0"/>
+          <w:i/>
+          <w:color w:val="444444"/>
+          <w:sz w:val="21"/>
+        </w:rPr>
+        <w:t>；</w:t>
+      </w:r>
+      <w:r>
+        <w:rPr>
+          <w:rFonts w:ascii="Times New Roman" w:hAnsi="Times New Roman" w:eastAsia="宋体"/>
+          <w:b/>
+          <w:i/>
+          <w:color w:val="444444"/>
+          <w:sz w:val="21"/>
+        </w:rPr>
+        <w:t>§6 补部署族基准覆盖边界</w:t>
+      </w:r>
+      <w:r>
+        <w:rPr>
+          <w:rFonts w:ascii="Times New Roman" w:hAnsi="Times New Roman" w:eastAsia="宋体"/>
+          <w:b w:val="0"/>
+          <w:i/>
+          <w:color w:val="444444"/>
+          <w:sz w:val="21"/>
+        </w:rPr>
+        <w:t>；</w:t>
+      </w:r>
+      <w:r>
+        <w:rPr>
+          <w:rFonts w:ascii="Times New Roman" w:hAnsi="Times New Roman" w:eastAsia="宋体"/>
+          <w:b/>
+          <w:i/>
+          <w:color w:val="444444"/>
+          <w:sz w:val="21"/>
+        </w:rPr>
+        <w:t>§9 新增 CS-20 正向随机侧</w:t>
+      </w:r>
+      <w:r>
+        <w:rPr>
+          <w:rFonts w:ascii="Times New Roman" w:hAnsi="Times New Roman" w:eastAsia="宋体"/>
+          <w:b w:val="0"/>
+          <w:i/>
+          <w:color w:val="444444"/>
+          <w:sz w:val="21"/>
+        </w:rPr>
+        <w:t>（</w:t>
+      </w:r>
+      <w:r>
+        <w:rPr>
+          <w:rFonts w:ascii="Consolas" w:hAnsi="Consolas" w:eastAsia="等线"/>
+          <w:b w:val="0"/>
+          <w:i w:val="0"/>
+          <w:color w:val="444444"/>
+          <w:sz w:val="19"/>
+        </w:rPr>
+        <w:t>pairwise_inner_bound_probabilistic</w:t>
+      </w:r>
+      <w:r>
+        <w:rPr>
+          <w:rFonts w:ascii="Times New Roman" w:hAnsi="Times New Roman" w:eastAsia="宋体"/>
+          <w:b w:val="0"/>
+          <w:i/>
+          <w:color w:val="444444"/>
+          <w:sz w:val="21"/>
+        </w:rPr>
+        <w:t>，ca_sparse_ext 已 Qed 沉没资产入文：超线性增长 p-偏置子阶梯 whp 逐对可控，与 T2b 构成随机侧对偶）。纯文本对齐，无定理改动。</w:t>
       </w:r>
     </w:p>
     <w:p>

</xml_diff>

<commit_message>
z3b sufficiency theorem: partition 77 merged (CI 09de44e green) + papers aligned (98187/77, [c,8) band) + probe source & OCaml bench archived
</commit_message>
<xml_diff>
--- a/papers/论文A中文规范版-CertifiedSparseGating.docx
+++ b/papers/论文A中文规范版-CertifiedSparseGating.docx
@@ -75,7 +75,7 @@
         <w:rPr>
           <w:rFonts w:hint="eastAsia"/>
         </w:rPr>
-        <w:t xml:space="preserve">v2.24（2026-09-01）｜代码基态：PSA_framework.v（18</w:t>
+        <w:t xml:space="preserve">v2.25（2026-09-02）｜代码基态：PSA_framework.v（18</w:t>
       </w:r>
       <w:r>
         <w:t xml:space="preserve"> </w:t>
@@ -208,7 +208,7 @@
         <w:t xml:space="preserve">区</w:t>
       </w:r>
       <w:r>
-        <w:t xml:space="preserve"> 60 </w:t>
+        <w:t xml:space="preserve"> 61 </w:t>
       </w:r>
       <w:r>
         <w:rPr>
@@ -248,7 +248,7 @@
           <w:b/>
           <w:bCs/>
         </w:rPr>
-        <w:t xml:space="preserve">41 </w:t>
+        <w:t xml:space="preserve">42 </w:t>
       </w:r>
       <w:r>
         <w:rPr>
@@ -399,22 +399,22 @@
           <w:b/>
           <w:bCs/>
         </w:rPr>
-        <w:t xml:space="preserve">ca_merged_full_25_m2.v（95848</w:t>
-      </w:r>
-      <w:r>
-        <w:rPr>
-          <w:b/>
-          <w:bCs/>
-        </w:rPr>
-        <w:t xml:space="preserve"> </w:t>
-      </w:r>
-      <w:r>
-        <w:rPr>
-          <w:rFonts w:hint="eastAsia"/>
-          <w:b/>
-          <w:bCs/>
-        </w:rPr>
-        <w:t xml:space="preserve">行，76</w:t>
+        <w:t xml:space="preserve">ca_merged_full_25_m2.v（98187</w:t>
+      </w:r>
+      <w:r>
+        <w:rPr>
+          <w:b/>
+          <w:bCs/>
+        </w:rPr>
+        <w:t xml:space="preserve"> </w:t>
+      </w:r>
+      <w:r>
+        <w:rPr>
+          <w:rFonts w:hint="eastAsia"/>
+          <w:b/>
+          <w:bCs/>
+        </w:rPr>
+        <w:t xml:space="preserve">行，77</w:t>
       </w:r>
       <w:r>
         <w:rPr>
@@ -627,6 +627,453 @@
           <w:rFonts w:hint="eastAsia"/>
         </w:rPr>
         <w:t xml:space="preserve">内核独立复验，五步全过</w:t>
+      </w:r>
+      <w:r>
+        <w:t xml:space="preserve"> </w:t>
+      </w:r>
+      <w:r>
+        <w:rPr>
+          <w:rFonts w:hint="eastAsia"/>
+        </w:rPr>
+        <w:t xml:space="preserve">修订摘要（v2.24→v2.25，2026-09-02，#3b</w:t>
+      </w:r>
+      <w:r>
+        <w:t xml:space="preserve"> z3b </w:t>
+      </w:r>
+      <w:r>
+        <w:rPr>
+          <w:rFonts w:hint="eastAsia"/>
+        </w:rPr>
+        <w:t xml:space="preserve">有效域充分性定理入文</w:t>
+      </w:r>
+      <w:r>
+        <w:t xml:space="preserve"> + </w:t>
+      </w:r>
+      <w:r>
+        <w:rPr>
+          <w:rFonts w:hint="eastAsia"/>
+        </w:rPr>
+        <w:t xml:space="preserve">合并版分区</w:t>
+      </w:r>
+      <w:r>
+        <w:t xml:space="preserve"> 77 </w:t>
+      </w:r>
+      <w:r>
+        <w:rPr>
+          <w:rFonts w:hint="eastAsia"/>
+        </w:rPr>
+        <w:t xml:space="preserve">批次）：</w:t>
+      </w:r>
+      <w:r>
+        <w:rPr>
+          <w:b/>
+          <w:bCs/>
+        </w:rPr>
+        <w:t xml:space="preserve">z3b_sufficiency</w:t>
+      </w:r>
+      <w:r>
+        <w:rPr>
+          <w:rFonts w:hint="eastAsia"/>
+        </w:rPr>
+        <w:t xml:space="preserve">（</w:t>
+      </w:r>
+      <w:r>
+        <w:rPr>
+          <w:rStyle w:val="VerbatimChar"/>
+        </w:rPr>
+        <w:t xml:space="preserve">probe_z3b_validregion.v</w:t>
+      </w:r>
+      <w:r>
+        <w:rPr>
+          <w:rFonts w:hint="eastAsia"/>
+        </w:rPr>
+        <w:t xml:space="preserve">，2314</w:t>
+      </w:r>
+      <w:r>
+        <w:t xml:space="preserve"> </w:t>
+      </w:r>
+      <w:r>
+        <w:rPr>
+          <w:rFonts w:hint="eastAsia"/>
+        </w:rPr>
+        <w:t xml:space="preserve">行、5</w:t>
+      </w:r>
+      <w:r>
+        <w:t xml:space="preserve"> </w:t>
+      </w:r>
+      <w:r>
+        <w:rPr>
+          <w:rFonts w:hint="eastAsia"/>
+        </w:rPr>
+        <w:t xml:space="preserve">段</w:t>
+      </w:r>
+      <w:r>
+        <w:t xml:space="preserve"> Print Assumptions </w:t>
+      </w:r>
+      <w:r>
+        <w:rPr>
+          <w:rFonts w:hint="eastAsia"/>
+        </w:rPr>
+        <w:t xml:space="preserve">全</w:t>
+      </w:r>
+      <w:r>
+        <w:t xml:space="preserve"> </w:t>
+      </w:r>
+      <w:r>
+        <w:rPr>
+          <w:rFonts w:hint="eastAsia"/>
+        </w:rPr>
+        <w:t xml:space="preserve">Closed：q=8</w:t>
+      </w:r>
+      <w:r>
+        <w:t xml:space="preserve"> </w:t>
+      </w:r>
+      <w:r>
+        <w:rPr>
+          <w:rFonts w:hint="eastAsia"/>
+        </w:rPr>
+        <w:t xml:space="preserve">几何阶梯（n0≥2、任意</w:t>
+      </w:r>
+      <w:r>
+        <w:t xml:space="preserve"> </w:t>
+      </w:r>
+      <w:r>
+        <w:rPr>
+          <w:rFonts w:hint="eastAsia"/>
+        </w:rPr>
+        <w:t xml:space="preserve">m≥1）</w:t>
+      </w:r>
+      <w:r>
+        <w:rPr>
+          <w:rFonts w:hint="eastAsia"/>
+          <w:b/>
+          <w:bCs/>
+        </w:rPr>
+        <w:t xml:space="preserve">无条件通过</w:t>
+      </w:r>
+      <w:r>
+        <w:t xml:space="preserve"> </w:t>
+      </w:r>
+      <w:r>
+        <w:rPr>
+          <w:rFonts w:hint="eastAsia"/>
+        </w:rPr>
+        <w:t xml:space="preserve">frame_check_instance——检查器充分性方向的构造性定理；与</w:t>
+      </w:r>
+      <w:r>
+        <w:t xml:space="preserve"> </w:t>
+      </w:r>
+      <w:r>
+        <w:rPr>
+          <w:rFonts w:hint="eastAsia"/>
+        </w:rPr>
+        <w:t xml:space="preserve">pareto_law_main（通过</w:t>
+      </w:r>
+      <w:r>
+        <w:t xml:space="preserve"> ⟹ </w:t>
+      </w:r>
+      <w:r>
+        <w:rPr>
+          <w:rFonts w:hint="eastAsia"/>
+        </w:rPr>
+        <w:t xml:space="preserve">比率</w:t>
+      </w:r>
+      <w:r>
+        <w:t xml:space="preserve"> ≥ </w:t>
+      </w:r>
+      <w:r>
+        <w:rPr>
+          <w:rFonts w:hint="eastAsia"/>
+        </w:rPr>
+        <w:t xml:space="preserve">c≈1.8501）合成</w:t>
+      </w:r>
+      <w:r>
+        <w:t xml:space="preserve"> ⟹ </w:t>
+      </w:r>
+      <w:r>
+        <w:rPr>
+          <w:rFonts w:hint="eastAsia"/>
+        </w:rPr>
+        <w:t xml:space="preserve">几何阶梯假阴性由此</w:t>
+      </w:r>
+      <w:r>
+        <w:rPr>
+          <w:rFonts w:hint="eastAsia"/>
+          <w:b/>
+          <w:bCs/>
+        </w:rPr>
+        <w:t xml:space="preserve">限定于显式比率带</w:t>
+      </w:r>
+      <w:r>
+        <w:rPr>
+          <w:b/>
+          <w:bCs/>
+        </w:rPr>
+        <w:t xml:space="preserve"> [c, 8) </w:t>
+      </w:r>
+      <w:r>
+        <w:rPr>
+          <w:rFonts w:hint="eastAsia"/>
+          <w:b/>
+          <w:bCs/>
+        </w:rPr>
+        <w:t xml:space="preserve">内</w:t>
+      </w:r>
+      <w:r>
+        <w:t xml:space="preserve">——「49.1% </w:t>
+      </w:r>
+      <w:r>
+        <w:rPr>
+          <w:rFonts w:hint="eastAsia"/>
+        </w:rPr>
+        <w:t xml:space="preserve">假阴性」系统扫描经验数字获得定理带刻画；纯构造性</w:t>
+      </w:r>
+      <w:r>
+        <w:t xml:space="preserve"> nat/Z/Q </w:t>
+      </w:r>
+      <w:r>
+        <w:rPr>
+          <w:rFonts w:hint="eastAsia"/>
+        </w:rPr>
+        <w:t xml:space="preserve">层（零</w:t>
+      </w:r>
+      <w:r>
+        <w:t xml:space="preserve"> </w:t>
+      </w:r>
+      <w:r>
+        <w:rPr>
+          <w:rFonts w:hint="eastAsia"/>
+        </w:rPr>
+        <w:t xml:space="preserve">CR、零经典、零</w:t>
+      </w:r>
+      <w:r>
+        <w:t xml:space="preserve"> </w:t>
+      </w:r>
+      <w:r>
+        <w:rPr>
+          <w:rFonts w:hint="eastAsia"/>
+        </w:rPr>
+        <w:t xml:space="preserve">Admitted）：左相位/右相位拆分</w:t>
+      </w:r>
+      <w:r>
+        <w:t xml:space="preserve"> + aux_fusion </w:t>
+      </w:r>
+      <w:r>
+        <w:rPr>
+          <w:rFonts w:hint="eastAsia"/>
+        </w:rPr>
+        <w:t xml:space="preserve">装配</w:t>
+      </w:r>
+      <w:r>
+        <w:t xml:space="preserve"> + z3b_cap_4_5 </w:t>
+      </w:r>
+      <w:r>
+        <w:rPr>
+          <w:rFonts w:hint="eastAsia"/>
+        </w:rPr>
+        <w:t xml:space="preserve">预算封口（无</w:t>
+      </w:r>
+      <w:r>
+        <w:t xml:space="preserve"> vm_compute </w:t>
+      </w:r>
+      <w:r>
+        <w:rPr>
+          <w:rFonts w:hint="eastAsia"/>
+        </w:rPr>
+        <w:t xml:space="preserve">的</w:t>
+      </w:r>
+      <w:r>
+        <w:t xml:space="preserve"> Z </w:t>
+      </w:r>
+      <w:r>
+        <w:rPr>
+          <w:rFonts w:hint="eastAsia"/>
+        </w:rPr>
+        <w:t xml:space="preserve">字面量桥配方，E235））；提取</w:t>
+      </w:r>
+      <w:r>
+        <w:t xml:space="preserve"> </w:t>
+      </w:r>
+      <w:r>
+        <w:rPr>
+          <w:rFonts w:hint="eastAsia"/>
+        </w:rPr>
+        <w:t xml:space="preserve">z3b_bench.ml（WSL</w:t>
+      </w:r>
+      <w:r>
+        <w:t xml:space="preserve"> </w:t>
+      </w:r>
+      <w:r>
+        <w:rPr>
+          <w:rFonts w:hint="eastAsia"/>
+        </w:rPr>
+        <w:t xml:space="preserve">ocamlopt：[2,16,128]</w:t>
+      </w:r>
+      <w:r>
+        <w:t xml:space="preserve"> </w:t>
+      </w:r>
+      <w:r>
+        <w:rPr>
+          <w:rFonts w:hint="eastAsia"/>
+        </w:rPr>
+        <w:t xml:space="preserve">机器实证</w:t>
+      </w:r>
+      <w:r>
+        <w:t xml:space="preserve"> true、[2,3] </w:t>
+      </w:r>
+      <w:r>
+        <w:rPr>
+          <w:rFonts w:hint="eastAsia"/>
+        </w:rPr>
+        <w:t xml:space="preserve">反例</w:t>
+      </w:r>
+      <w:r>
+        <w:t xml:space="preserve"> </w:t>
+      </w:r>
+      <w:r>
+        <w:rPr>
+          <w:rFonts w:hint="eastAsia"/>
+        </w:rPr>
+        <w:t xml:space="preserve">false——可提取</w:t>
+      </w:r>
+      <w:r>
+        <w:t xml:space="preserve"> OCaml </w:t>
+      </w:r>
+      <w:r>
+        <w:rPr>
+          <w:rFonts w:hint="eastAsia"/>
+        </w:rPr>
+        <w:t xml:space="preserve">硬要求闭环）；</w:t>
+      </w:r>
+      <w:r>
+        <w:rPr>
+          <w:rFonts w:hint="eastAsia"/>
+          <w:b/>
+          <w:bCs/>
+        </w:rPr>
+        <w:t xml:space="preserve">合并版分区</w:t>
+      </w:r>
+      <w:r>
+        <w:rPr>
+          <w:b/>
+          <w:bCs/>
+        </w:rPr>
+        <w:t xml:space="preserve"> 77 </w:t>
+      </w:r>
+      <w:r>
+        <w:rPr>
+          <w:rFonts w:hint="eastAsia"/>
+          <w:b/>
+          <w:bCs/>
+        </w:rPr>
+        <w:t xml:space="preserve">追加</w:t>
+      </w:r>
+      <w:r>
+        <w:rPr>
+          <w:rFonts w:hint="eastAsia"/>
+        </w:rPr>
+        <w:t xml:space="preserve">（98187</w:t>
+      </w:r>
+      <w:r>
+        <w:t xml:space="preserve"> </w:t>
+      </w:r>
+      <w:r>
+        <w:rPr>
+          <w:rFonts w:hint="eastAsia"/>
+        </w:rPr>
+        <w:t xml:space="preserve">行；</w:t>
+      </w:r>
+      <w:r>
+        <w:rPr>
+          <w:rStyle w:val="VerbatimChar"/>
+        </w:rPr>
+        <w:t xml:space="preserve">++</w:t>
+      </w:r>
+      <w:r>
+        <w:t xml:space="preserve"> </w:t>
+      </w:r>
+      <w:r>
+        <w:rPr>
+          <w:rFonts w:hint="eastAsia"/>
+        </w:rPr>
+        <w:t xml:space="preserve">记号劫持/逗号链四形态/rewrite-by</w:t>
+      </w:r>
+      <w:r>
+        <w:t xml:space="preserve"> </w:t>
+      </w:r>
+      <w:r>
+        <w:rPr>
+          <w:rFonts w:hint="eastAsia"/>
+        </w:rPr>
+        <w:t xml:space="preserve">带参变体五类雷谱修复落</w:t>
+      </w:r>
+      <w:r>
+        <w:t xml:space="preserve"> z </w:t>
+      </w:r>
+      <w:r>
+        <w:rPr>
+          <w:rFonts w:hint="eastAsia"/>
+        </w:rPr>
+        <w:t xml:space="preserve">源双环境同步——《合并友好编码规范》R1-R5、经验卡</w:t>
+      </w:r>
+      <w:r>
+        <w:t xml:space="preserve"> </w:t>
+      </w:r>
+      <w:r>
+        <w:rPr>
+          <w:rFonts w:hint="eastAsia"/>
+        </w:rPr>
+        <w:t xml:space="preserve">E235）；</w:t>
+      </w:r>
+      <w:r>
+        <w:rPr>
+          <w:rFonts w:hint="eastAsia"/>
+          <w:b/>
+          <w:bCs/>
+        </w:rPr>
+        <w:t xml:space="preserve">口径刷新</w:t>
+      </w:r>
+      <w:r>
+        <w:rPr>
+          <w:rFonts w:hint="eastAsia"/>
+        </w:rPr>
+        <w:t xml:space="preserve">——95848/76→98187/77、「全量并入至</w:t>
+      </w:r>
+      <w:r>
+        <w:t xml:space="preserve"> </w:t>
+      </w:r>
+      <w:r>
+        <w:rPr>
+          <w:rFonts w:hint="eastAsia"/>
+        </w:rPr>
+        <w:t xml:space="preserve">Z2b」→「至</w:t>
+      </w:r>
+      <w:r>
+        <w:t xml:space="preserve"> z3b」、census </w:t>
+      </w:r>
+      <w:r>
+        <w:rPr>
+          <w:rFonts w:hint="eastAsia"/>
+        </w:rPr>
+        <w:t xml:space="preserve">60→61、已并入探针分区</w:t>
+      </w:r>
+      <w:r>
+        <w:t xml:space="preserve"> </w:t>
+      </w:r>
+      <w:r>
+        <w:rPr>
+          <w:rFonts w:hint="eastAsia"/>
+        </w:rPr>
+        <w:t xml:space="preserve">41→42、附录状态列与</w:t>
+      </w:r>
+      <w:r>
+        <w:t xml:space="preserve"> B </w:t>
+      </w:r>
+      <w:r>
+        <w:rPr>
+          <w:rFonts w:hint="eastAsia"/>
+        </w:rPr>
+        <w:t xml:space="preserve">侧同步。</w:t>
       </w:r>
       <w:r>
         <w:t xml:space="preserve"> </w:t>
@@ -18501,16 +18948,52 @@
         <w:rPr>
           <w:rFonts w:hint="eastAsia"/>
         </w:rPr>
-        <w:t xml:space="preserve">49.1%，占拒绝</w:t>
-      </w:r>
-      <w:r>
-        <w:t xml:space="preserve"> </w:t>
-      </w:r>
-      <w:r>
-        <w:rPr>
-          <w:rFonts w:hint="eastAsia"/>
-        </w:rPr>
-        <w:t xml:space="preserve">70.9%），集中于"有用"族（C=2/3-sparse、几何奇带）——"可判定性溢价"是当前有理松弛实现的保守性代价（局限），收紧方向：</w:t>
+        <w:t xml:space="preserve">49.1%、占拒绝</w:t>
+      </w:r>
+      <w:r>
+        <w:t xml:space="preserve"> </w:t>
+      </w:r>
+      <w:r>
+        <w:rPr>
+          <w:rFonts w:hint="eastAsia"/>
+        </w:rPr>
+        <w:t xml:space="preserve">70.9%；z3b</w:t>
+      </w:r>
+      <w:r>
+        <w:t xml:space="preserve"> </w:t>
+      </w:r>
+      <w:r>
+        <w:rPr>
+          <w:rFonts w:hint="eastAsia"/>
+        </w:rPr>
+        <w:t xml:space="preserve">充分性定理（分区</w:t>
+      </w:r>
+      <w:r>
+        <w:t xml:space="preserve"> </w:t>
+      </w:r>
+      <w:r>
+        <w:rPr>
+          <w:rFonts w:hint="eastAsia"/>
+        </w:rPr>
+        <w:t xml:space="preserve">77）证明</w:t>
+      </w:r>
+      <w:r>
+        <w:t xml:space="preserve"> q=8 </w:t>
+      </w:r>
+      <w:r>
+        <w:rPr>
+          <w:rFonts w:hint="eastAsia"/>
+        </w:rPr>
+        <w:t xml:space="preserve">几何阶梯无条件通过检查器，几何阶梯假阴性由此限定于显式比率带</w:t>
+      </w:r>
+      <w:r>
+        <w:t xml:space="preserve"> [c, 8) </w:t>
+      </w:r>
+      <w:r>
+        <w:rPr>
+          <w:rFonts w:hint="eastAsia"/>
+        </w:rPr>
+        <w:t xml:space="preserve">内），集中于"有用"族（C=2/3-sparse、几何奇带）——"可判定性溢价"是当前有理松弛实现的保守性代价（局限），收紧方向：</w:t>
       </w:r>
       <w:r>
         <w:rPr>
@@ -43649,16 +44132,16 @@
         <w:rPr>
           <w:rFonts w:hint="eastAsia"/>
         </w:rPr>
-        <w:t xml:space="preserve">m2（95848</w:t>
-      </w:r>
-      <w:r>
-        <w:t xml:space="preserve"> </w:t>
-      </w:r>
-      <w:r>
-        <w:rPr>
-          <w:rFonts w:hint="eastAsia"/>
-        </w:rPr>
-        <w:t xml:space="preserve">行/76</w:t>
+        <w:t xml:space="preserve">m2（现</w:t>
+      </w:r>
+      <w:r>
+        <w:t xml:space="preserve"> 98187 </w:t>
+      </w:r>
+      <w:r>
+        <w:rPr>
+          <w:rFonts w:hint="eastAsia"/>
+        </w:rPr>
+        <w:t xml:space="preserve">行/77</w:t>
       </w:r>
       <w:r>
         <w:t xml:space="preserve"> </w:t>

</xml_diff>